<commit_message>
ЛР8 Containers TESTS update
</commit_message>
<xml_diff>
--- a/ЛР8/Камольцев_ЛР8.docx
+++ b/ЛР8/Камольцев_ЛР8.docx
@@ -2893,16 +2893,7 @@
           <w:sz w:val="28"/>
           <w:szCs w:val="28"/>
         </w:rPr>
-        <w:t>доступ к элементу по индексу</w:t>
-      </w:r>
-      <w:r>
-        <w:rPr>
-          <w:rFonts w:ascii="Times New Roman" w:hAnsi="Times New Roman" w:cs="Times New Roman"/>
-          <w:color w:val="000000"/>
-          <w:sz w:val="28"/>
-          <w:szCs w:val="28"/>
-        </w:rPr>
-        <w:t xml:space="preserve"> </w:t>
+        <w:t xml:space="preserve">доступ к элементу по индексу </w:t>
       </w:r>
       <w:r>
         <w:rPr>
@@ -4205,7 +4196,6 @@
           <w:color w:val="000000"/>
           <w:sz w:val="28"/>
           <w:szCs w:val="28"/>
-          <w:lang w:val="en-US"/>
         </w:rPr>
         <w:t xml:space="preserve"> </w:t>
       </w:r>
@@ -4224,7 +4214,6 @@
           <w:color w:val="000000"/>
           <w:sz w:val="28"/>
           <w:szCs w:val="28"/>
-          <w:lang w:val="en-US"/>
         </w:rPr>
         <w:t>3</w:t>
       </w:r>
@@ -4648,7 +4637,6 @@
           <w:rFonts w:ascii="Times New Roman" w:hAnsi="Times New Roman" w:cs="Times New Roman"/>
           <w:sz w:val="28"/>
           <w:szCs w:val="28"/>
-          <w:lang w:val="en-US"/>
         </w:rPr>
       </w:pPr>
       <w:r>
@@ -4906,7 +4894,6 @@
           <w:bCs/>
           <w:sz w:val="28"/>
           <w:szCs w:val="28"/>
-          <w:lang w:val="en-US"/>
         </w:rPr>
       </w:pPr>
     </w:p>
@@ -5077,23 +5064,7 @@
           <w:sz w:val="28"/>
           <w:szCs w:val="28"/>
         </w:rPr>
-        <w:t xml:space="preserve"> </w:t>
-      </w:r>
-      <w:r>
-        <w:rPr>
-          <w:rFonts w:ascii="Times New Roman" w:hAnsi="Times New Roman" w:cs="Times New Roman"/>
-          <w:sz w:val="28"/>
-          <w:szCs w:val="28"/>
-        </w:rPr>
-        <w:t>Apache</w:t>
-      </w:r>
-      <w:r>
-        <w:rPr>
-          <w:rFonts w:ascii="Times New Roman" w:hAnsi="Times New Roman" w:cs="Times New Roman"/>
-          <w:sz w:val="28"/>
-          <w:szCs w:val="28"/>
-        </w:rPr>
-        <w:t xml:space="preserve"> </w:t>
+        <w:t xml:space="preserve"> Apache </w:t>
       </w:r>
       <w:r>
         <w:rPr>
@@ -5459,7 +5430,41 @@
           <w:sz w:val="28"/>
           <w:szCs w:val="28"/>
         </w:rPr>
-        <w:t xml:space="preserve">для размеров от </w:t>
+        <w:t>для размеров</w:t>
+      </w:r>
+      <w:r>
+        <w:rPr>
+          <w:rFonts w:ascii="Times New Roman" w:hAnsi="Times New Roman" w:cs="Times New Roman"/>
+          <w:sz w:val="28"/>
+          <w:szCs w:val="28"/>
+        </w:rPr>
+        <w:t>:</w:t>
+      </w:r>
+    </w:p>
+    <w:p>
+      <w:pPr>
+        <w:pStyle w:val="a7"/>
+        <w:numPr>
+          <w:ilvl w:val="0"/>
+          <w:numId w:val="34"/>
+        </w:numPr>
+        <w:spacing w:after="0" w:line="360" w:lineRule="auto"/>
+        <w:jc w:val="both"/>
+        <w:rPr>
+          <w:rFonts w:ascii="Times New Roman" w:hAnsi="Times New Roman" w:cs="Times New Roman"/>
+          <w:sz w:val="28"/>
+          <w:szCs w:val="28"/>
+          <w:highlight w:val="yellow"/>
+        </w:rPr>
+      </w:pPr>
+      <w:r>
+        <w:rPr>
+          <w:rFonts w:ascii="Times New Roman" w:hAnsi="Times New Roman" w:cs="Times New Roman"/>
+          <w:sz w:val="28"/>
+          <w:szCs w:val="28"/>
+          <w:highlight w:val="yellow"/>
+        </w:rPr>
+        <w:t xml:space="preserve">от </w:t>
       </w:r>
       <w:r>
         <w:rPr>
@@ -5468,16 +5473,9 @@
           <w:bCs/>
           <w:sz w:val="28"/>
           <w:szCs w:val="28"/>
+          <w:highlight w:val="yellow"/>
         </w:rPr>
         <w:t>1000</w:t>
-      </w:r>
-      <w:r>
-        <w:rPr>
-          <w:rFonts w:ascii="Times New Roman" w:hAnsi="Times New Roman" w:cs="Times New Roman"/>
-          <w:sz w:val="28"/>
-          <w:szCs w:val="28"/>
-        </w:rPr>
-        <w:t xml:space="preserve"> до </w:t>
       </w:r>
       <w:r>
         <w:rPr>
@@ -5486,8 +5484,18 @@
           <w:bCs/>
           <w:sz w:val="28"/>
           <w:szCs w:val="28"/>
-        </w:rPr>
-        <w:t>10</w:t>
+          <w:highlight w:val="yellow"/>
+        </w:rPr>
+        <w:t>0</w:t>
+      </w:r>
+      <w:r>
+        <w:rPr>
+          <w:rFonts w:ascii="Times New Roman" w:hAnsi="Times New Roman" w:cs="Times New Roman"/>
+          <w:sz w:val="28"/>
+          <w:szCs w:val="28"/>
+          <w:highlight w:val="yellow"/>
+        </w:rPr>
+        <w:t xml:space="preserve"> до </w:t>
       </w:r>
       <w:r>
         <w:rPr>
@@ -5496,8 +5504,9 @@
           <w:bCs/>
           <w:sz w:val="28"/>
           <w:szCs w:val="28"/>
-        </w:rPr>
-        <w:t xml:space="preserve"> </w:t>
+          <w:highlight w:val="yellow"/>
+        </w:rPr>
+        <w:t>10</w:t>
       </w:r>
       <w:r>
         <w:rPr>
@@ -5506,52 +5515,226 @@
           <w:bCs/>
           <w:sz w:val="28"/>
           <w:szCs w:val="28"/>
-        </w:rPr>
-        <w:t>000</w:t>
-      </w:r>
-      <w:r>
-        <w:rPr>
-          <w:rFonts w:ascii="Times New Roman" w:hAnsi="Times New Roman" w:cs="Times New Roman"/>
-          <w:sz w:val="28"/>
-          <w:szCs w:val="28"/>
-        </w:rPr>
-        <w:t xml:space="preserve"> с шагом 500. Этот диапазон хранится в массиве </w:t>
-      </w:r>
-      <w:proofErr w:type="spellStart"/>
-      <w:r>
-        <w:rPr>
-          <w:rFonts w:ascii="Times New Roman" w:hAnsi="Times New Roman" w:cs="Times New Roman"/>
-          <w:sz w:val="28"/>
-          <w:szCs w:val="28"/>
-        </w:rPr>
-        <w:t>sizes</w:t>
-      </w:r>
-      <w:proofErr w:type="spellEnd"/>
-      <w:r>
-        <w:rPr>
-          <w:rFonts w:ascii="Times New Roman" w:hAnsi="Times New Roman" w:cs="Times New Roman"/>
-          <w:sz w:val="28"/>
-          <w:szCs w:val="28"/>
-        </w:rPr>
-        <w:t>.</w:t>
-      </w:r>
-    </w:p>
-    <w:p>
-      <w:pPr>
+          <w:highlight w:val="yellow"/>
+          <w:lang w:val="en-US"/>
+        </w:rPr>
+        <w:t>0</w:t>
+      </w:r>
+      <w:r>
+        <w:rPr>
+          <w:rFonts w:ascii="Times New Roman" w:hAnsi="Times New Roman" w:cs="Times New Roman"/>
+          <w:b/>
+          <w:bCs/>
+          <w:sz w:val="28"/>
+          <w:szCs w:val="28"/>
+          <w:highlight w:val="yellow"/>
+        </w:rPr>
+        <w:t xml:space="preserve"> 000</w:t>
+      </w:r>
+      <w:r>
+        <w:rPr>
+          <w:rFonts w:ascii="Times New Roman" w:hAnsi="Times New Roman" w:cs="Times New Roman"/>
+          <w:sz w:val="28"/>
+          <w:szCs w:val="28"/>
+          <w:highlight w:val="yellow"/>
+        </w:rPr>
+        <w:t xml:space="preserve"> с шагом </w:t>
+      </w:r>
+      <w:r>
+        <w:rPr>
+          <w:rFonts w:ascii="Times New Roman" w:hAnsi="Times New Roman" w:cs="Times New Roman"/>
+          <w:sz w:val="28"/>
+          <w:szCs w:val="28"/>
+          <w:highlight w:val="yellow"/>
+          <w:lang w:val="en-US"/>
+        </w:rPr>
+        <w:t>100</w:t>
+      </w:r>
+      <w:r>
+        <w:rPr>
+          <w:rFonts w:ascii="Times New Roman" w:hAnsi="Times New Roman" w:cs="Times New Roman"/>
+          <w:sz w:val="28"/>
+          <w:szCs w:val="28"/>
+          <w:highlight w:val="yellow"/>
+        </w:rPr>
+        <w:t>00</w:t>
+      </w:r>
+      <w:r>
+        <w:rPr>
+          <w:rFonts w:ascii="Times New Roman" w:hAnsi="Times New Roman" w:cs="Times New Roman"/>
+          <w:sz w:val="28"/>
+          <w:szCs w:val="28"/>
+          <w:highlight w:val="yellow"/>
+          <w:lang w:val="en-US"/>
+        </w:rPr>
+        <w:t>;</w:t>
+      </w:r>
+    </w:p>
+    <w:p>
+      <w:pPr>
+        <w:pStyle w:val="a7"/>
+        <w:numPr>
+          <w:ilvl w:val="0"/>
+          <w:numId w:val="34"/>
+        </w:numPr>
         <w:spacing w:after="0" w:line="360" w:lineRule="auto"/>
         <w:jc w:val="both"/>
         <w:rPr>
           <w:rFonts w:ascii="Times New Roman" w:hAnsi="Times New Roman" w:cs="Times New Roman"/>
           <w:sz w:val="28"/>
           <w:szCs w:val="28"/>
-        </w:rPr>
-      </w:pPr>
-      <w:r>
-        <w:rPr>
-          <w:rFonts w:ascii="Times New Roman" w:hAnsi="Times New Roman" w:cs="Times New Roman"/>
-          <w:sz w:val="28"/>
-          <w:szCs w:val="28"/>
+          <w:highlight w:val="yellow"/>
+        </w:rPr>
+      </w:pPr>
+      <w:r>
+        <w:rPr>
+          <w:rFonts w:ascii="Times New Roman" w:hAnsi="Times New Roman" w:cs="Times New Roman"/>
+          <w:sz w:val="28"/>
+          <w:szCs w:val="28"/>
+          <w:highlight w:val="yellow"/>
+        </w:rPr>
+        <w:t xml:space="preserve"> </w:t>
+      </w:r>
+      <w:r>
+        <w:rPr>
+          <w:rFonts w:ascii="Times New Roman" w:hAnsi="Times New Roman" w:cs="Times New Roman"/>
+          <w:sz w:val="28"/>
+          <w:szCs w:val="28"/>
+          <w:highlight w:val="yellow"/>
+        </w:rPr>
+        <w:t xml:space="preserve">от </w:t>
+      </w:r>
+      <w:r>
+        <w:rPr>
+          <w:rFonts w:ascii="Times New Roman" w:hAnsi="Times New Roman" w:cs="Times New Roman"/>
+          <w:b/>
+          <w:bCs/>
+          <w:sz w:val="28"/>
+          <w:szCs w:val="28"/>
+          <w:highlight w:val="yellow"/>
           <w:lang w:val="en-US"/>
+        </w:rPr>
+        <w:t>2</w:t>
+      </w:r>
+      <w:r>
+        <w:rPr>
+          <w:rFonts w:ascii="Times New Roman" w:hAnsi="Times New Roman" w:cs="Times New Roman"/>
+          <w:b/>
+          <w:bCs/>
+          <w:sz w:val="28"/>
+          <w:szCs w:val="28"/>
+          <w:highlight w:val="yellow"/>
+        </w:rPr>
+        <w:t>0000</w:t>
+      </w:r>
+      <w:r>
+        <w:rPr>
+          <w:rFonts w:ascii="Times New Roman" w:hAnsi="Times New Roman" w:cs="Times New Roman"/>
+          <w:sz w:val="28"/>
+          <w:szCs w:val="28"/>
+          <w:highlight w:val="yellow"/>
+        </w:rPr>
+        <w:t xml:space="preserve"> до </w:t>
+      </w:r>
+      <w:r>
+        <w:rPr>
+          <w:rFonts w:ascii="Times New Roman" w:hAnsi="Times New Roman" w:cs="Times New Roman"/>
+          <w:b/>
+          <w:bCs/>
+          <w:sz w:val="28"/>
+          <w:szCs w:val="28"/>
+          <w:highlight w:val="yellow"/>
+          <w:lang w:val="en-US"/>
+        </w:rPr>
+        <w:t>20</w:t>
+      </w:r>
+      <w:r>
+        <w:rPr>
+          <w:rFonts w:ascii="Times New Roman" w:hAnsi="Times New Roman" w:cs="Times New Roman"/>
+          <w:b/>
+          <w:bCs/>
+          <w:sz w:val="28"/>
+          <w:szCs w:val="28"/>
+          <w:highlight w:val="yellow"/>
+          <w:lang w:val="en-US"/>
+        </w:rPr>
+        <w:t>0</w:t>
+      </w:r>
+      <w:r>
+        <w:rPr>
+          <w:rFonts w:ascii="Times New Roman" w:hAnsi="Times New Roman" w:cs="Times New Roman"/>
+          <w:b/>
+          <w:bCs/>
+          <w:sz w:val="28"/>
+          <w:szCs w:val="28"/>
+          <w:highlight w:val="yellow"/>
+        </w:rPr>
+        <w:t xml:space="preserve"> 000</w:t>
+      </w:r>
+      <w:r>
+        <w:rPr>
+          <w:rFonts w:ascii="Times New Roman" w:hAnsi="Times New Roman" w:cs="Times New Roman"/>
+          <w:sz w:val="28"/>
+          <w:szCs w:val="28"/>
+          <w:highlight w:val="yellow"/>
+        </w:rPr>
+        <w:t xml:space="preserve"> с шагом </w:t>
+      </w:r>
+      <w:r>
+        <w:rPr>
+          <w:rFonts w:ascii="Times New Roman" w:hAnsi="Times New Roman" w:cs="Times New Roman"/>
+          <w:sz w:val="28"/>
+          <w:szCs w:val="28"/>
+          <w:highlight w:val="yellow"/>
+          <w:lang w:val="en-US"/>
+        </w:rPr>
+        <w:t>2</w:t>
+      </w:r>
+      <w:r>
+        <w:rPr>
+          <w:rFonts w:ascii="Times New Roman" w:hAnsi="Times New Roman" w:cs="Times New Roman"/>
+          <w:sz w:val="28"/>
+          <w:szCs w:val="28"/>
+          <w:highlight w:val="yellow"/>
+          <w:lang w:val="en-US"/>
+        </w:rPr>
+        <w:t>00</w:t>
+      </w:r>
+      <w:r>
+        <w:rPr>
+          <w:rFonts w:ascii="Times New Roman" w:hAnsi="Times New Roman" w:cs="Times New Roman"/>
+          <w:sz w:val="28"/>
+          <w:szCs w:val="28"/>
+          <w:highlight w:val="yellow"/>
+        </w:rPr>
+        <w:t>00</w:t>
+      </w:r>
+      <w:r>
+        <w:rPr>
+          <w:rFonts w:ascii="Times New Roman" w:hAnsi="Times New Roman" w:cs="Times New Roman"/>
+          <w:sz w:val="28"/>
+          <w:szCs w:val="28"/>
+          <w:highlight w:val="yellow"/>
+          <w:lang w:val="en-US"/>
+        </w:rPr>
+        <w:t>.</w:t>
+      </w:r>
+    </w:p>
+    <w:p>
+      <w:pPr>
+        <w:spacing w:after="0" w:line="360" w:lineRule="auto"/>
+        <w:jc w:val="both"/>
+        <w:rPr>
+          <w:rFonts w:ascii="Times New Roman" w:hAnsi="Times New Roman" w:cs="Times New Roman"/>
+          <w:sz w:val="28"/>
+          <w:szCs w:val="28"/>
+        </w:rPr>
+      </w:pPr>
+      <w:r>
+        <w:rPr>
+          <w:rFonts w:ascii="Times New Roman" w:hAnsi="Times New Roman" w:cs="Times New Roman"/>
+          <w:sz w:val="28"/>
+          <w:szCs w:val="28"/>
         </w:rPr>
         <w:tab/>
       </w:r>
@@ -6579,17 +6762,6 @@
           <w:szCs w:val="28"/>
         </w:rPr>
       </w:pPr>
-    </w:p>
-    <w:p>
-      <w:pPr>
-        <w:spacing w:after="0" w:line="360" w:lineRule="auto"/>
-        <w:jc w:val="both"/>
-        <w:rPr>
-          <w:rFonts w:ascii="Times New Roman" w:hAnsi="Times New Roman" w:cs="Times New Roman"/>
-          <w:sz w:val="28"/>
-          <w:szCs w:val="28"/>
-        </w:rPr>
-      </w:pPr>
       <w:r>
         <w:rPr>
           <w:rFonts w:ascii="Times New Roman" w:hAnsi="Times New Roman" w:cs="Times New Roman"/>
@@ -6822,10 +6994,24 @@
         <w:rPr>
           <w:rStyle w:val="af"/>
           <w:rFonts w:ascii="Times New Roman" w:hAnsi="Times New Roman" w:cs="Times New Roman"/>
-          <w:sz w:val="28"/>
-          <w:szCs w:val="28"/>
-        </w:rPr>
-        <w:t>Время поиска</w:t>
+          <w:b w:val="0"/>
+          <w:bCs w:val="0"/>
+          <w:sz w:val="28"/>
+          <w:szCs w:val="28"/>
+        </w:rPr>
+        <w:t xml:space="preserve">Время </w:t>
+      </w:r>
+      <w:r>
+        <w:rPr>
+          <w:rStyle w:val="af"/>
+          <w:rFonts w:ascii="Times New Roman" w:hAnsi="Times New Roman" w:cs="Times New Roman"/>
+          <w:b w:val="0"/>
+          <w:bCs w:val="0"/>
+          <w:sz w:val="28"/>
+          <w:szCs w:val="28"/>
+          <w:u w:val="single"/>
+        </w:rPr>
+        <w:t>поиска</w:t>
       </w:r>
       <w:r>
         <w:rPr>
@@ -11602,271 +11788,27 @@
           <w:szCs w:val="16"/>
           <w:lang w:val="en-US" w:eastAsia="ru-RU"/>
         </w:rPr>
-        <w:t xml:space="preserve">        </w:t>
-      </w:r>
-      <w:proofErr w:type="gramStart"/>
-      <w:r>
-        <w:rPr>
-          <w:rFonts w:ascii="Consolas" w:eastAsia="Times New Roman" w:hAnsi="Consolas" w:cs="Times New Roman"/>
-          <w:color w:val="4EC9B0"/>
-          <w:sz w:val="16"/>
-          <w:szCs w:val="16"/>
-          <w:lang w:val="en-US" w:eastAsia="ru-RU"/>
-        </w:rPr>
-        <w:t>int</w:t>
-      </w:r>
-      <w:r>
-        <w:rPr>
-          <w:rFonts w:ascii="Consolas" w:eastAsia="Times New Roman" w:hAnsi="Consolas" w:cs="Times New Roman"/>
-          <w:color w:val="CCCCCC"/>
-          <w:sz w:val="16"/>
-          <w:szCs w:val="16"/>
-          <w:lang w:val="en-US" w:eastAsia="ru-RU"/>
-        </w:rPr>
-        <w:t>[</w:t>
-      </w:r>
-      <w:proofErr w:type="gramEnd"/>
-      <w:r>
-        <w:rPr>
-          <w:rFonts w:ascii="Consolas" w:eastAsia="Times New Roman" w:hAnsi="Consolas" w:cs="Times New Roman"/>
-          <w:color w:val="CCCCCC"/>
-          <w:sz w:val="16"/>
-          <w:szCs w:val="16"/>
-          <w:lang w:val="en-US" w:eastAsia="ru-RU"/>
-        </w:rPr>
-        <w:t xml:space="preserve">] </w:t>
-      </w:r>
-      <w:r>
-        <w:rPr>
-          <w:rFonts w:ascii="Consolas" w:eastAsia="Times New Roman" w:hAnsi="Consolas" w:cs="Times New Roman"/>
-          <w:color w:val="9CDCFE"/>
-          <w:sz w:val="16"/>
-          <w:szCs w:val="16"/>
-          <w:lang w:val="en-US" w:eastAsia="ru-RU"/>
-        </w:rPr>
-        <w:t>sizes</w:t>
-      </w:r>
-      <w:r>
-        <w:rPr>
-          <w:rFonts w:ascii="Consolas" w:eastAsia="Times New Roman" w:hAnsi="Consolas" w:cs="Times New Roman"/>
-          <w:color w:val="CCCCCC"/>
-          <w:sz w:val="16"/>
-          <w:szCs w:val="16"/>
-          <w:lang w:val="en-US" w:eastAsia="ru-RU"/>
-        </w:rPr>
-        <w:t xml:space="preserve"> </w:t>
-      </w:r>
-      <w:r>
-        <w:rPr>
-          <w:rFonts w:ascii="Consolas" w:eastAsia="Times New Roman" w:hAnsi="Consolas" w:cs="Times New Roman"/>
-          <w:color w:val="D4D4D4"/>
-          <w:sz w:val="16"/>
-          <w:szCs w:val="16"/>
-          <w:lang w:val="en-US" w:eastAsia="ru-RU"/>
-        </w:rPr>
-        <w:t>=</w:t>
-      </w:r>
-      <w:r>
-        <w:rPr>
-          <w:rFonts w:ascii="Consolas" w:eastAsia="Times New Roman" w:hAnsi="Consolas" w:cs="Times New Roman"/>
-          <w:color w:val="CCCCCC"/>
-          <w:sz w:val="16"/>
-          <w:szCs w:val="16"/>
-          <w:lang w:val="en-US" w:eastAsia="ru-RU"/>
-        </w:rPr>
-        <w:t xml:space="preserve"> </w:t>
-      </w:r>
-      <w:r>
-        <w:rPr>
-          <w:rFonts w:ascii="Consolas" w:eastAsia="Times New Roman" w:hAnsi="Consolas" w:cs="Times New Roman"/>
-          <w:color w:val="C586C0"/>
-          <w:sz w:val="16"/>
-          <w:szCs w:val="16"/>
-          <w:lang w:val="en-US" w:eastAsia="ru-RU"/>
-        </w:rPr>
-        <w:t>new</w:t>
-      </w:r>
-      <w:r>
-        <w:rPr>
-          <w:rFonts w:ascii="Consolas" w:eastAsia="Times New Roman" w:hAnsi="Consolas" w:cs="Times New Roman"/>
-          <w:color w:val="CCCCCC"/>
-          <w:sz w:val="16"/>
-          <w:szCs w:val="16"/>
-          <w:lang w:val="en-US" w:eastAsia="ru-RU"/>
-        </w:rPr>
-        <w:t xml:space="preserve"> </w:t>
-      </w:r>
-      <w:proofErr w:type="gramStart"/>
-      <w:r>
-        <w:rPr>
-          <w:rFonts w:ascii="Consolas" w:eastAsia="Times New Roman" w:hAnsi="Consolas" w:cs="Times New Roman"/>
-          <w:color w:val="4EC9B0"/>
-          <w:sz w:val="16"/>
-          <w:szCs w:val="16"/>
-          <w:lang w:val="en-US" w:eastAsia="ru-RU"/>
-        </w:rPr>
-        <w:t>int</w:t>
-      </w:r>
-      <w:r>
-        <w:rPr>
-          <w:rFonts w:ascii="Consolas" w:eastAsia="Times New Roman" w:hAnsi="Consolas" w:cs="Times New Roman"/>
-          <w:color w:val="CCCCCC"/>
-          <w:sz w:val="16"/>
-          <w:szCs w:val="16"/>
-          <w:lang w:val="en-US" w:eastAsia="ru-RU"/>
-        </w:rPr>
-        <w:t>[</w:t>
-      </w:r>
-      <w:proofErr w:type="gramEnd"/>
-      <w:r>
-        <w:rPr>
-          <w:rFonts w:ascii="Consolas" w:eastAsia="Times New Roman" w:hAnsi="Consolas" w:cs="Times New Roman"/>
-          <w:color w:val="B5CEA8"/>
-          <w:sz w:val="16"/>
-          <w:szCs w:val="16"/>
-          <w:lang w:val="en-US" w:eastAsia="ru-RU"/>
-        </w:rPr>
-        <w:t>19</w:t>
-      </w:r>
-      <w:r>
-        <w:rPr>
-          <w:rFonts w:ascii="Consolas" w:eastAsia="Times New Roman" w:hAnsi="Consolas" w:cs="Times New Roman"/>
-          <w:color w:val="CCCCCC"/>
-          <w:sz w:val="16"/>
-          <w:szCs w:val="16"/>
-          <w:lang w:val="en-US" w:eastAsia="ru-RU"/>
-        </w:rPr>
-        <w:t xml:space="preserve">]; </w:t>
-      </w:r>
-      <w:r>
-        <w:rPr>
-          <w:rFonts w:ascii="Consolas" w:eastAsia="Times New Roman" w:hAnsi="Consolas" w:cs="Times New Roman"/>
-          <w:color w:val="6A9955"/>
-          <w:sz w:val="16"/>
-          <w:szCs w:val="16"/>
-          <w:lang w:val="en-US" w:eastAsia="ru-RU"/>
-        </w:rPr>
-        <w:t xml:space="preserve">// </w:t>
-      </w:r>
-      <w:r>
-        <w:rPr>
-          <w:rFonts w:ascii="Consolas" w:eastAsia="Times New Roman" w:hAnsi="Consolas" w:cs="Times New Roman"/>
-          <w:color w:val="6A9955"/>
-          <w:sz w:val="16"/>
-          <w:szCs w:val="16"/>
-          <w:lang w:eastAsia="ru-RU"/>
-        </w:rPr>
-        <w:t>Массив</w:t>
-      </w:r>
-      <w:r>
-        <w:rPr>
-          <w:rFonts w:ascii="Consolas" w:eastAsia="Times New Roman" w:hAnsi="Consolas" w:cs="Times New Roman"/>
-          <w:color w:val="6A9955"/>
-          <w:sz w:val="16"/>
-          <w:szCs w:val="16"/>
-          <w:lang w:val="en-US" w:eastAsia="ru-RU"/>
-        </w:rPr>
-        <w:t xml:space="preserve"> </w:t>
-      </w:r>
-      <w:r>
-        <w:rPr>
-          <w:rFonts w:ascii="Consolas" w:eastAsia="Times New Roman" w:hAnsi="Consolas" w:cs="Times New Roman"/>
-          <w:color w:val="6A9955"/>
-          <w:sz w:val="16"/>
-          <w:szCs w:val="16"/>
-          <w:lang w:eastAsia="ru-RU"/>
-        </w:rPr>
-        <w:t>размеров</w:t>
-      </w:r>
-      <w:r>
-        <w:rPr>
-          <w:rFonts w:ascii="Consolas" w:eastAsia="Times New Roman" w:hAnsi="Consolas" w:cs="Times New Roman"/>
-          <w:color w:val="6A9955"/>
-          <w:sz w:val="16"/>
-          <w:szCs w:val="16"/>
-          <w:lang w:val="en-US" w:eastAsia="ru-RU"/>
-        </w:rPr>
-        <w:t xml:space="preserve"> </w:t>
-      </w:r>
-      <w:r>
-        <w:rPr>
-          <w:rFonts w:ascii="Consolas" w:eastAsia="Times New Roman" w:hAnsi="Consolas" w:cs="Times New Roman"/>
-          <w:color w:val="6A9955"/>
-          <w:sz w:val="16"/>
-          <w:szCs w:val="16"/>
-          <w:lang w:eastAsia="ru-RU"/>
-        </w:rPr>
-        <w:t>от</w:t>
-      </w:r>
-      <w:r>
-        <w:rPr>
-          <w:rFonts w:ascii="Consolas" w:eastAsia="Times New Roman" w:hAnsi="Consolas" w:cs="Times New Roman"/>
-          <w:color w:val="6A9955"/>
-          <w:sz w:val="16"/>
-          <w:szCs w:val="16"/>
-          <w:lang w:val="en-US" w:eastAsia="ru-RU"/>
-        </w:rPr>
-        <w:t xml:space="preserve"> 1000 </w:t>
-      </w:r>
-      <w:r>
-        <w:rPr>
-          <w:rFonts w:ascii="Consolas" w:eastAsia="Times New Roman" w:hAnsi="Consolas" w:cs="Times New Roman"/>
-          <w:color w:val="6A9955"/>
-          <w:sz w:val="16"/>
-          <w:szCs w:val="16"/>
-          <w:lang w:eastAsia="ru-RU"/>
-        </w:rPr>
-        <w:t>до</w:t>
-      </w:r>
-      <w:r>
-        <w:rPr>
-          <w:rFonts w:ascii="Consolas" w:eastAsia="Times New Roman" w:hAnsi="Consolas" w:cs="Times New Roman"/>
-          <w:color w:val="6A9955"/>
-          <w:sz w:val="16"/>
-          <w:szCs w:val="16"/>
-          <w:lang w:val="en-US" w:eastAsia="ru-RU"/>
-        </w:rPr>
-        <w:t xml:space="preserve"> 10000 </w:t>
-      </w:r>
-      <w:r>
-        <w:rPr>
-          <w:rFonts w:ascii="Consolas" w:eastAsia="Times New Roman" w:hAnsi="Consolas" w:cs="Times New Roman"/>
-          <w:color w:val="6A9955"/>
-          <w:sz w:val="16"/>
-          <w:szCs w:val="16"/>
-          <w:lang w:eastAsia="ru-RU"/>
-        </w:rPr>
-        <w:t>с</w:t>
-      </w:r>
-      <w:r>
-        <w:rPr>
-          <w:rFonts w:ascii="Consolas" w:eastAsia="Times New Roman" w:hAnsi="Consolas" w:cs="Times New Roman"/>
-          <w:color w:val="6A9955"/>
-          <w:sz w:val="16"/>
-          <w:szCs w:val="16"/>
-          <w:lang w:val="en-US" w:eastAsia="ru-RU"/>
-        </w:rPr>
-        <w:t xml:space="preserve"> </w:t>
-      </w:r>
-      <w:r>
-        <w:rPr>
-          <w:rFonts w:ascii="Consolas" w:eastAsia="Times New Roman" w:hAnsi="Consolas" w:cs="Times New Roman"/>
-          <w:color w:val="6A9955"/>
-          <w:sz w:val="16"/>
-          <w:szCs w:val="16"/>
-          <w:lang w:eastAsia="ru-RU"/>
-        </w:rPr>
-        <w:t>шагом</w:t>
-      </w:r>
-      <w:r>
-        <w:rPr>
-          <w:rFonts w:ascii="Consolas" w:eastAsia="Times New Roman" w:hAnsi="Consolas" w:cs="Times New Roman"/>
-          <w:color w:val="6A9955"/>
-          <w:sz w:val="16"/>
-          <w:szCs w:val="16"/>
-          <w:lang w:val="en-US" w:eastAsia="ru-RU"/>
-        </w:rPr>
-        <w:t xml:space="preserve"> 500</w:t>
+        <w:t>        int start = 10000;</w:t>
+      </w:r>
+      <w:r>
+        <w:rPr>
+          <w:rFonts w:ascii="Consolas" w:eastAsia="Times New Roman" w:hAnsi="Consolas" w:cs="Times New Roman"/>
+          <w:color w:val="CCCCCC"/>
+          <w:sz w:val="16"/>
+          <w:szCs w:val="16"/>
+          <w:lang w:val="en-US" w:eastAsia="ru-RU"/>
+        </w:rPr>
+        <w:t xml:space="preserve"> // </w:t>
+      </w:r>
+      <w:r>
+        <w:rPr>
+          <w:rFonts w:ascii="Consolas" w:eastAsia="Times New Roman" w:hAnsi="Consolas" w:cs="Times New Roman"/>
+          <w:color w:val="CCCCCC"/>
+          <w:sz w:val="16"/>
+          <w:szCs w:val="16"/>
+          <w:lang w:val="en-US" w:eastAsia="ru-RU"/>
+        </w:rPr>
+        <w:t>20000</w:t>
       </w:r>
     </w:p>
     <w:p>
@@ -11889,321 +11831,17 @@
           <w:szCs w:val="16"/>
           <w:lang w:val="en-US" w:eastAsia="ru-RU"/>
         </w:rPr>
-        <w:t xml:space="preserve">        </w:t>
-      </w:r>
-      <w:r>
-        <w:rPr>
-          <w:rFonts w:ascii="Consolas" w:eastAsia="Times New Roman" w:hAnsi="Consolas" w:cs="Times New Roman"/>
-          <w:color w:val="C586C0"/>
-          <w:sz w:val="16"/>
-          <w:szCs w:val="16"/>
-          <w:lang w:val="en-US" w:eastAsia="ru-RU"/>
-        </w:rPr>
-        <w:t>for</w:t>
-      </w:r>
-      <w:r>
-        <w:rPr>
-          <w:rFonts w:ascii="Consolas" w:eastAsia="Times New Roman" w:hAnsi="Consolas" w:cs="Times New Roman"/>
-          <w:color w:val="CCCCCC"/>
-          <w:sz w:val="16"/>
-          <w:szCs w:val="16"/>
-          <w:lang w:val="en-US" w:eastAsia="ru-RU"/>
-        </w:rPr>
-        <w:t xml:space="preserve"> (</w:t>
-      </w:r>
-      <w:r>
-        <w:rPr>
-          <w:rFonts w:ascii="Consolas" w:eastAsia="Times New Roman" w:hAnsi="Consolas" w:cs="Times New Roman"/>
-          <w:color w:val="4EC9B0"/>
-          <w:sz w:val="16"/>
-          <w:szCs w:val="16"/>
-          <w:lang w:val="en-US" w:eastAsia="ru-RU"/>
-        </w:rPr>
-        <w:t>int</w:t>
-      </w:r>
-      <w:r>
-        <w:rPr>
-          <w:rFonts w:ascii="Consolas" w:eastAsia="Times New Roman" w:hAnsi="Consolas" w:cs="Times New Roman"/>
-          <w:color w:val="CCCCCC"/>
-          <w:sz w:val="16"/>
-          <w:szCs w:val="16"/>
-          <w:lang w:val="en-US" w:eastAsia="ru-RU"/>
-        </w:rPr>
-        <w:t xml:space="preserve"> </w:t>
-      </w:r>
-      <w:proofErr w:type="spellStart"/>
-      <w:r>
-        <w:rPr>
-          <w:rFonts w:ascii="Consolas" w:eastAsia="Times New Roman" w:hAnsi="Consolas" w:cs="Times New Roman"/>
-          <w:color w:val="9CDCFE"/>
-          <w:sz w:val="16"/>
-          <w:szCs w:val="16"/>
-          <w:lang w:val="en-US" w:eastAsia="ru-RU"/>
-        </w:rPr>
-        <w:t>i</w:t>
-      </w:r>
-      <w:proofErr w:type="spellEnd"/>
-      <w:r>
-        <w:rPr>
-          <w:rFonts w:ascii="Consolas" w:eastAsia="Times New Roman" w:hAnsi="Consolas" w:cs="Times New Roman"/>
-          <w:color w:val="CCCCCC"/>
-          <w:sz w:val="16"/>
-          <w:szCs w:val="16"/>
-          <w:lang w:val="en-US" w:eastAsia="ru-RU"/>
-        </w:rPr>
-        <w:t xml:space="preserve"> </w:t>
-      </w:r>
-      <w:r>
-        <w:rPr>
-          <w:rFonts w:ascii="Consolas" w:eastAsia="Times New Roman" w:hAnsi="Consolas" w:cs="Times New Roman"/>
-          <w:color w:val="D4D4D4"/>
-          <w:sz w:val="16"/>
-          <w:szCs w:val="16"/>
-          <w:lang w:val="en-US" w:eastAsia="ru-RU"/>
-        </w:rPr>
-        <w:t>=</w:t>
-      </w:r>
-      <w:r>
-        <w:rPr>
-          <w:rFonts w:ascii="Consolas" w:eastAsia="Times New Roman" w:hAnsi="Consolas" w:cs="Times New Roman"/>
-          <w:color w:val="CCCCCC"/>
-          <w:sz w:val="16"/>
-          <w:szCs w:val="16"/>
-          <w:lang w:val="en-US" w:eastAsia="ru-RU"/>
-        </w:rPr>
-        <w:t xml:space="preserve"> </w:t>
-      </w:r>
-      <w:r>
-        <w:rPr>
-          <w:rFonts w:ascii="Consolas" w:eastAsia="Times New Roman" w:hAnsi="Consolas" w:cs="Times New Roman"/>
-          <w:color w:val="B5CEA8"/>
-          <w:sz w:val="16"/>
-          <w:szCs w:val="16"/>
-          <w:lang w:val="en-US" w:eastAsia="ru-RU"/>
-        </w:rPr>
-        <w:t>0</w:t>
-      </w:r>
-      <w:r>
-        <w:rPr>
-          <w:rFonts w:ascii="Consolas" w:eastAsia="Times New Roman" w:hAnsi="Consolas" w:cs="Times New Roman"/>
-          <w:color w:val="CCCCCC"/>
-          <w:sz w:val="16"/>
-          <w:szCs w:val="16"/>
-          <w:lang w:val="en-US" w:eastAsia="ru-RU"/>
-        </w:rPr>
-        <w:t xml:space="preserve">, </w:t>
-      </w:r>
-      <w:r>
-        <w:rPr>
-          <w:rFonts w:ascii="Consolas" w:eastAsia="Times New Roman" w:hAnsi="Consolas" w:cs="Times New Roman"/>
-          <w:color w:val="9CDCFE"/>
-          <w:sz w:val="16"/>
-          <w:szCs w:val="16"/>
-          <w:lang w:val="en-US" w:eastAsia="ru-RU"/>
-        </w:rPr>
-        <w:t>size</w:t>
-      </w:r>
-      <w:r>
-        <w:rPr>
-          <w:rFonts w:ascii="Consolas" w:eastAsia="Times New Roman" w:hAnsi="Consolas" w:cs="Times New Roman"/>
-          <w:color w:val="CCCCCC"/>
-          <w:sz w:val="16"/>
-          <w:szCs w:val="16"/>
-          <w:lang w:val="en-US" w:eastAsia="ru-RU"/>
-        </w:rPr>
-        <w:t xml:space="preserve"> </w:t>
-      </w:r>
-      <w:r>
-        <w:rPr>
-          <w:rFonts w:ascii="Consolas" w:eastAsia="Times New Roman" w:hAnsi="Consolas" w:cs="Times New Roman"/>
-          <w:color w:val="D4D4D4"/>
-          <w:sz w:val="16"/>
-          <w:szCs w:val="16"/>
-          <w:lang w:val="en-US" w:eastAsia="ru-RU"/>
-        </w:rPr>
-        <w:t>=</w:t>
-      </w:r>
-      <w:r>
-        <w:rPr>
-          <w:rFonts w:ascii="Consolas" w:eastAsia="Times New Roman" w:hAnsi="Consolas" w:cs="Times New Roman"/>
-          <w:color w:val="CCCCCC"/>
-          <w:sz w:val="16"/>
-          <w:szCs w:val="16"/>
-          <w:lang w:val="en-US" w:eastAsia="ru-RU"/>
-        </w:rPr>
-        <w:t xml:space="preserve"> </w:t>
-      </w:r>
-      <w:r>
-        <w:rPr>
-          <w:rFonts w:ascii="Consolas" w:eastAsia="Times New Roman" w:hAnsi="Consolas" w:cs="Times New Roman"/>
-          <w:color w:val="B5CEA8"/>
-          <w:sz w:val="16"/>
-          <w:szCs w:val="16"/>
-          <w:lang w:val="en-US" w:eastAsia="ru-RU"/>
-        </w:rPr>
-        <w:t>1000</w:t>
-      </w:r>
-      <w:r>
-        <w:rPr>
-          <w:rFonts w:ascii="Consolas" w:eastAsia="Times New Roman" w:hAnsi="Consolas" w:cs="Times New Roman"/>
-          <w:color w:val="CCCCCC"/>
-          <w:sz w:val="16"/>
-          <w:szCs w:val="16"/>
-          <w:lang w:val="en-US" w:eastAsia="ru-RU"/>
-        </w:rPr>
-        <w:t xml:space="preserve">; </w:t>
-      </w:r>
-      <w:r>
-        <w:rPr>
-          <w:rFonts w:ascii="Consolas" w:eastAsia="Times New Roman" w:hAnsi="Consolas" w:cs="Times New Roman"/>
-          <w:color w:val="9CDCFE"/>
-          <w:sz w:val="16"/>
-          <w:szCs w:val="16"/>
-          <w:lang w:val="en-US" w:eastAsia="ru-RU"/>
-        </w:rPr>
-        <w:t>size</w:t>
-      </w:r>
-      <w:r>
-        <w:rPr>
-          <w:rFonts w:ascii="Consolas" w:eastAsia="Times New Roman" w:hAnsi="Consolas" w:cs="Times New Roman"/>
-          <w:color w:val="CCCCCC"/>
-          <w:sz w:val="16"/>
-          <w:szCs w:val="16"/>
-          <w:lang w:val="en-US" w:eastAsia="ru-RU"/>
-        </w:rPr>
-        <w:t xml:space="preserve"> </w:t>
-      </w:r>
-      <w:r>
-        <w:rPr>
-          <w:rFonts w:ascii="Consolas" w:eastAsia="Times New Roman" w:hAnsi="Consolas" w:cs="Times New Roman"/>
-          <w:color w:val="D4D4D4"/>
-          <w:sz w:val="16"/>
-          <w:szCs w:val="16"/>
-          <w:lang w:val="en-US" w:eastAsia="ru-RU"/>
-        </w:rPr>
-        <w:t>&lt;=</w:t>
-      </w:r>
-      <w:r>
-        <w:rPr>
-          <w:rFonts w:ascii="Consolas" w:eastAsia="Times New Roman" w:hAnsi="Consolas" w:cs="Times New Roman"/>
-          <w:color w:val="CCCCCC"/>
-          <w:sz w:val="16"/>
-          <w:szCs w:val="16"/>
-          <w:lang w:val="en-US" w:eastAsia="ru-RU"/>
-        </w:rPr>
-        <w:t xml:space="preserve"> </w:t>
-      </w:r>
-      <w:r>
-        <w:rPr>
-          <w:rFonts w:ascii="Consolas" w:eastAsia="Times New Roman" w:hAnsi="Consolas" w:cs="Times New Roman"/>
-          <w:color w:val="B5CEA8"/>
-          <w:sz w:val="16"/>
-          <w:szCs w:val="16"/>
-          <w:lang w:val="en-US" w:eastAsia="ru-RU"/>
-        </w:rPr>
-        <w:t>10000</w:t>
-      </w:r>
-      <w:r>
-        <w:rPr>
-          <w:rFonts w:ascii="Consolas" w:eastAsia="Times New Roman" w:hAnsi="Consolas" w:cs="Times New Roman"/>
-          <w:color w:val="CCCCCC"/>
-          <w:sz w:val="16"/>
-          <w:szCs w:val="16"/>
-          <w:lang w:val="en-US" w:eastAsia="ru-RU"/>
-        </w:rPr>
-        <w:t xml:space="preserve">; </w:t>
-      </w:r>
-      <w:r>
-        <w:rPr>
-          <w:rFonts w:ascii="Consolas" w:eastAsia="Times New Roman" w:hAnsi="Consolas" w:cs="Times New Roman"/>
-          <w:color w:val="9CDCFE"/>
-          <w:sz w:val="16"/>
-          <w:szCs w:val="16"/>
-          <w:lang w:val="en-US" w:eastAsia="ru-RU"/>
-        </w:rPr>
-        <w:t>size</w:t>
-      </w:r>
-      <w:r>
-        <w:rPr>
-          <w:rFonts w:ascii="Consolas" w:eastAsia="Times New Roman" w:hAnsi="Consolas" w:cs="Times New Roman"/>
-          <w:color w:val="CCCCCC"/>
-          <w:sz w:val="16"/>
-          <w:szCs w:val="16"/>
-          <w:lang w:val="en-US" w:eastAsia="ru-RU"/>
-        </w:rPr>
-        <w:t xml:space="preserve"> </w:t>
-      </w:r>
-      <w:r>
-        <w:rPr>
-          <w:rFonts w:ascii="Consolas" w:eastAsia="Times New Roman" w:hAnsi="Consolas" w:cs="Times New Roman"/>
-          <w:color w:val="D4D4D4"/>
-          <w:sz w:val="16"/>
-          <w:szCs w:val="16"/>
-          <w:lang w:val="en-US" w:eastAsia="ru-RU"/>
-        </w:rPr>
-        <w:t>+=</w:t>
-      </w:r>
-      <w:r>
-        <w:rPr>
-          <w:rFonts w:ascii="Consolas" w:eastAsia="Times New Roman" w:hAnsi="Consolas" w:cs="Times New Roman"/>
-          <w:color w:val="CCCCCC"/>
-          <w:sz w:val="16"/>
-          <w:szCs w:val="16"/>
-          <w:lang w:val="en-US" w:eastAsia="ru-RU"/>
-        </w:rPr>
-        <w:t xml:space="preserve"> </w:t>
-      </w:r>
-      <w:r>
-        <w:rPr>
-          <w:rFonts w:ascii="Consolas" w:eastAsia="Times New Roman" w:hAnsi="Consolas" w:cs="Times New Roman"/>
-          <w:color w:val="B5CEA8"/>
-          <w:sz w:val="16"/>
-          <w:szCs w:val="16"/>
-          <w:lang w:val="en-US" w:eastAsia="ru-RU"/>
-        </w:rPr>
-        <w:t>500</w:t>
-      </w:r>
-      <w:r>
-        <w:rPr>
-          <w:rFonts w:ascii="Consolas" w:eastAsia="Times New Roman" w:hAnsi="Consolas" w:cs="Times New Roman"/>
-          <w:color w:val="CCCCCC"/>
-          <w:sz w:val="16"/>
-          <w:szCs w:val="16"/>
-          <w:lang w:val="en-US" w:eastAsia="ru-RU"/>
-        </w:rPr>
-        <w:t xml:space="preserve">, </w:t>
-      </w:r>
-      <w:proofErr w:type="spellStart"/>
-      <w:r>
-        <w:rPr>
-          <w:rFonts w:ascii="Consolas" w:eastAsia="Times New Roman" w:hAnsi="Consolas" w:cs="Times New Roman"/>
-          <w:color w:val="9CDCFE"/>
-          <w:sz w:val="16"/>
-          <w:szCs w:val="16"/>
-          <w:lang w:val="en-US" w:eastAsia="ru-RU"/>
-        </w:rPr>
-        <w:t>i</w:t>
-      </w:r>
-      <w:proofErr w:type="spellEnd"/>
-      <w:r>
-        <w:rPr>
-          <w:rFonts w:ascii="Consolas" w:eastAsia="Times New Roman" w:hAnsi="Consolas" w:cs="Times New Roman"/>
-          <w:color w:val="D4D4D4"/>
-          <w:sz w:val="16"/>
-          <w:szCs w:val="16"/>
-          <w:lang w:val="en-US" w:eastAsia="ru-RU"/>
-        </w:rPr>
-        <w:t>++</w:t>
-      </w:r>
-      <w:r>
-        <w:rPr>
-          <w:rFonts w:ascii="Consolas" w:eastAsia="Times New Roman" w:hAnsi="Consolas" w:cs="Times New Roman"/>
-          <w:color w:val="CCCCCC"/>
-          <w:sz w:val="16"/>
-          <w:szCs w:val="16"/>
-          <w:lang w:val="en-US" w:eastAsia="ru-RU"/>
-        </w:rPr>
-        <w:t>) {</w:t>
+        <w:t>        int end = 100000;</w:t>
+      </w:r>
+      <w:r>
+        <w:rPr>
+          <w:rFonts w:ascii="Consolas" w:eastAsia="Times New Roman" w:hAnsi="Consolas" w:cs="Times New Roman"/>
+          <w:color w:val="CCCCCC"/>
+          <w:sz w:val="16"/>
+          <w:szCs w:val="16"/>
+          <w:lang w:val="en-US" w:eastAsia="ru-RU"/>
+        </w:rPr>
+        <w:t xml:space="preserve"> // 200000</w:t>
       </w:r>
     </w:p>
     <w:p>
@@ -12226,89 +11864,27 @@
           <w:szCs w:val="16"/>
           <w:lang w:val="en-US" w:eastAsia="ru-RU"/>
         </w:rPr>
-        <w:t xml:space="preserve">            </w:t>
-      </w:r>
-      <w:r>
-        <w:rPr>
-          <w:rFonts w:ascii="Consolas" w:eastAsia="Times New Roman" w:hAnsi="Consolas" w:cs="Times New Roman"/>
-          <w:color w:val="9CDCFE"/>
-          <w:sz w:val="16"/>
-          <w:szCs w:val="16"/>
-          <w:lang w:val="en-US" w:eastAsia="ru-RU"/>
-        </w:rPr>
-        <w:t>sizes</w:t>
-      </w:r>
-      <w:r>
-        <w:rPr>
-          <w:rFonts w:ascii="Consolas" w:eastAsia="Times New Roman" w:hAnsi="Consolas" w:cs="Times New Roman"/>
-          <w:color w:val="CCCCCC"/>
-          <w:sz w:val="16"/>
-          <w:szCs w:val="16"/>
-          <w:lang w:val="en-US" w:eastAsia="ru-RU"/>
-        </w:rPr>
-        <w:t>[</w:t>
-      </w:r>
-      <w:proofErr w:type="spellStart"/>
-      <w:r>
-        <w:rPr>
-          <w:rFonts w:ascii="Consolas" w:eastAsia="Times New Roman" w:hAnsi="Consolas" w:cs="Times New Roman"/>
-          <w:color w:val="9CDCFE"/>
-          <w:sz w:val="16"/>
-          <w:szCs w:val="16"/>
-          <w:lang w:val="en-US" w:eastAsia="ru-RU"/>
-        </w:rPr>
-        <w:t>i</w:t>
-      </w:r>
-      <w:proofErr w:type="spellEnd"/>
-      <w:r>
-        <w:rPr>
-          <w:rFonts w:ascii="Consolas" w:eastAsia="Times New Roman" w:hAnsi="Consolas" w:cs="Times New Roman"/>
-          <w:color w:val="CCCCCC"/>
-          <w:sz w:val="16"/>
-          <w:szCs w:val="16"/>
-          <w:lang w:val="en-US" w:eastAsia="ru-RU"/>
-        </w:rPr>
-        <w:t xml:space="preserve">] </w:t>
-      </w:r>
-      <w:r>
-        <w:rPr>
-          <w:rFonts w:ascii="Consolas" w:eastAsia="Times New Roman" w:hAnsi="Consolas" w:cs="Times New Roman"/>
-          <w:color w:val="D4D4D4"/>
-          <w:sz w:val="16"/>
-          <w:szCs w:val="16"/>
-          <w:lang w:val="en-US" w:eastAsia="ru-RU"/>
-        </w:rPr>
-        <w:t>=</w:t>
-      </w:r>
-      <w:r>
-        <w:rPr>
-          <w:rFonts w:ascii="Consolas" w:eastAsia="Times New Roman" w:hAnsi="Consolas" w:cs="Times New Roman"/>
-          <w:color w:val="CCCCCC"/>
-          <w:sz w:val="16"/>
-          <w:szCs w:val="16"/>
-          <w:lang w:val="en-US" w:eastAsia="ru-RU"/>
-        </w:rPr>
-        <w:t xml:space="preserve"> </w:t>
-      </w:r>
-      <w:r>
-        <w:rPr>
-          <w:rFonts w:ascii="Consolas" w:eastAsia="Times New Roman" w:hAnsi="Consolas" w:cs="Times New Roman"/>
-          <w:color w:val="9CDCFE"/>
-          <w:sz w:val="16"/>
-          <w:szCs w:val="16"/>
-          <w:lang w:val="en-US" w:eastAsia="ru-RU"/>
-        </w:rPr>
-        <w:t>size</w:t>
-      </w:r>
-      <w:r>
-        <w:rPr>
-          <w:rFonts w:ascii="Consolas" w:eastAsia="Times New Roman" w:hAnsi="Consolas" w:cs="Times New Roman"/>
-          <w:color w:val="CCCCCC"/>
-          <w:sz w:val="16"/>
-          <w:szCs w:val="16"/>
-          <w:lang w:val="en-US" w:eastAsia="ru-RU"/>
-        </w:rPr>
-        <w:t>;</w:t>
+        <w:t>        int step = 10000;</w:t>
+      </w:r>
+      <w:r>
+        <w:rPr>
+          <w:rFonts w:ascii="Consolas" w:eastAsia="Times New Roman" w:hAnsi="Consolas" w:cs="Times New Roman"/>
+          <w:color w:val="CCCCCC"/>
+          <w:sz w:val="16"/>
+          <w:szCs w:val="16"/>
+          <w:lang w:val="en-US" w:eastAsia="ru-RU"/>
+        </w:rPr>
+        <w:t xml:space="preserve"> //</w:t>
+      </w:r>
+      <w:r>
+        <w:rPr>
+          <w:rFonts w:ascii="Consolas" w:eastAsia="Times New Roman" w:hAnsi="Consolas" w:cs="Times New Roman"/>
+          <w:color w:val="CCCCCC"/>
+          <w:sz w:val="16"/>
+          <w:szCs w:val="16"/>
+          <w:lang w:val="en-US" w:eastAsia="ru-RU"/>
+        </w:rPr>
+        <w:t xml:space="preserve"> 20000</w:t>
       </w:r>
     </w:p>
     <w:p>
@@ -12331,7 +11907,7 @@
           <w:szCs w:val="16"/>
           <w:lang w:val="en-US" w:eastAsia="ru-RU"/>
         </w:rPr>
-        <w:t>        }</w:t>
+        <w:t>        int size = (end - start) / step + 1;</w:t>
       </w:r>
     </w:p>
     <w:p>
@@ -12346,6 +11922,16 @@
           <w:lang w:val="en-US" w:eastAsia="ru-RU"/>
         </w:rPr>
       </w:pPr>
+      <w:r>
+        <w:rPr>
+          <w:rFonts w:ascii="Consolas" w:eastAsia="Times New Roman" w:hAnsi="Consolas" w:cs="Times New Roman"/>
+          <w:color w:val="CCCCCC"/>
+          <w:sz w:val="16"/>
+          <w:szCs w:val="16"/>
+          <w:lang w:val="en-US" w:eastAsia="ru-RU"/>
+        </w:rPr>
+        <w:t xml:space="preserve">        </w:t>
+      </w:r>
     </w:p>
     <w:p>
       <w:pPr>
@@ -12370,87 +11956,27 @@
         <w:lastRenderedPageBreak/>
         <w:t xml:space="preserve">        </w:t>
       </w:r>
-      <w:r>
-        <w:rPr>
-          <w:rFonts w:ascii="Consolas" w:eastAsia="Times New Roman" w:hAnsi="Consolas" w:cs="Times New Roman"/>
-          <w:color w:val="4EC9B0"/>
-          <w:sz w:val="16"/>
-          <w:szCs w:val="16"/>
-          <w:lang w:val="en-US" w:eastAsia="ru-RU"/>
-        </w:rPr>
-        <w:t>int</w:t>
-      </w:r>
-      <w:r>
-        <w:rPr>
-          <w:rFonts w:ascii="Consolas" w:eastAsia="Times New Roman" w:hAnsi="Consolas" w:cs="Times New Roman"/>
-          <w:color w:val="CCCCCC"/>
-          <w:sz w:val="16"/>
-          <w:szCs w:val="16"/>
-          <w:lang w:val="en-US" w:eastAsia="ru-RU"/>
-        </w:rPr>
-        <w:t xml:space="preserve"> </w:t>
-      </w:r>
-      <w:proofErr w:type="spellStart"/>
-      <w:r>
-        <w:rPr>
-          <w:rFonts w:ascii="Consolas" w:eastAsia="Times New Roman" w:hAnsi="Consolas" w:cs="Times New Roman"/>
-          <w:color w:val="9CDCFE"/>
-          <w:sz w:val="16"/>
-          <w:szCs w:val="16"/>
-          <w:lang w:val="en-US" w:eastAsia="ru-RU"/>
-        </w:rPr>
-        <w:t>numberOfSearches</w:t>
-      </w:r>
-      <w:proofErr w:type="spellEnd"/>
-      <w:r>
-        <w:rPr>
-          <w:rFonts w:ascii="Consolas" w:eastAsia="Times New Roman" w:hAnsi="Consolas" w:cs="Times New Roman"/>
-          <w:color w:val="CCCCCC"/>
-          <w:sz w:val="16"/>
-          <w:szCs w:val="16"/>
-          <w:lang w:val="en-US" w:eastAsia="ru-RU"/>
-        </w:rPr>
-        <w:t xml:space="preserve"> </w:t>
-      </w:r>
-      <w:r>
-        <w:rPr>
-          <w:rFonts w:ascii="Consolas" w:eastAsia="Times New Roman" w:hAnsi="Consolas" w:cs="Times New Roman"/>
-          <w:color w:val="D4D4D4"/>
-          <w:sz w:val="16"/>
-          <w:szCs w:val="16"/>
-          <w:lang w:val="en-US" w:eastAsia="ru-RU"/>
-        </w:rPr>
-        <w:t>=</w:t>
-      </w:r>
-      <w:r>
-        <w:rPr>
-          <w:rFonts w:ascii="Consolas" w:eastAsia="Times New Roman" w:hAnsi="Consolas" w:cs="Times New Roman"/>
-          <w:color w:val="CCCCCC"/>
-          <w:sz w:val="16"/>
-          <w:szCs w:val="16"/>
-          <w:lang w:val="en-US" w:eastAsia="ru-RU"/>
-        </w:rPr>
-        <w:t xml:space="preserve"> </w:t>
-      </w:r>
-      <w:r>
-        <w:rPr>
-          <w:rFonts w:ascii="Consolas" w:eastAsia="Times New Roman" w:hAnsi="Consolas" w:cs="Times New Roman"/>
-          <w:color w:val="B5CEA8"/>
-          <w:sz w:val="16"/>
-          <w:szCs w:val="16"/>
-          <w:lang w:val="en-US" w:eastAsia="ru-RU"/>
-        </w:rPr>
-        <w:t>100000</w:t>
-      </w:r>
-      <w:r>
-        <w:rPr>
-          <w:rFonts w:ascii="Consolas" w:eastAsia="Times New Roman" w:hAnsi="Consolas" w:cs="Times New Roman"/>
-          <w:color w:val="CCCCCC"/>
-          <w:sz w:val="16"/>
-          <w:szCs w:val="16"/>
-          <w:lang w:val="en-US" w:eastAsia="ru-RU"/>
-        </w:rPr>
-        <w:t>;</w:t>
+      <w:proofErr w:type="gramStart"/>
+      <w:r>
+        <w:rPr>
+          <w:rFonts w:ascii="Consolas" w:eastAsia="Times New Roman" w:hAnsi="Consolas" w:cs="Times New Roman"/>
+          <w:color w:val="CCCCCC"/>
+          <w:sz w:val="16"/>
+          <w:szCs w:val="16"/>
+          <w:lang w:val="en-US" w:eastAsia="ru-RU"/>
+        </w:rPr>
+        <w:t>int[</w:t>
+      </w:r>
+      <w:proofErr w:type="gramEnd"/>
+      <w:r>
+        <w:rPr>
+          <w:rFonts w:ascii="Consolas" w:eastAsia="Times New Roman" w:hAnsi="Consolas" w:cs="Times New Roman"/>
+          <w:color w:val="CCCCCC"/>
+          <w:sz w:val="16"/>
+          <w:szCs w:val="16"/>
+          <w:lang w:val="en-US" w:eastAsia="ru-RU"/>
+        </w:rPr>
+        <w:t>] sizes = new int[size];</w:t>
       </w:r>
     </w:p>
     <w:p>
@@ -12465,6 +11991,126 @@
           <w:lang w:val="en-US" w:eastAsia="ru-RU"/>
         </w:rPr>
       </w:pPr>
+      <w:r>
+        <w:rPr>
+          <w:rFonts w:ascii="Consolas" w:eastAsia="Times New Roman" w:hAnsi="Consolas" w:cs="Times New Roman"/>
+          <w:color w:val="CCCCCC"/>
+          <w:sz w:val="16"/>
+          <w:szCs w:val="16"/>
+          <w:lang w:val="en-US" w:eastAsia="ru-RU"/>
+        </w:rPr>
+        <w:t xml:space="preserve">        for (int </w:t>
+      </w:r>
+      <w:proofErr w:type="spellStart"/>
+      <w:r>
+        <w:rPr>
+          <w:rFonts w:ascii="Consolas" w:eastAsia="Times New Roman" w:hAnsi="Consolas" w:cs="Times New Roman"/>
+          <w:color w:val="CCCCCC"/>
+          <w:sz w:val="16"/>
+          <w:szCs w:val="16"/>
+          <w:lang w:val="en-US" w:eastAsia="ru-RU"/>
+        </w:rPr>
+        <w:t>i</w:t>
+      </w:r>
+      <w:proofErr w:type="spellEnd"/>
+      <w:r>
+        <w:rPr>
+          <w:rFonts w:ascii="Consolas" w:eastAsia="Times New Roman" w:hAnsi="Consolas" w:cs="Times New Roman"/>
+          <w:color w:val="CCCCCC"/>
+          <w:sz w:val="16"/>
+          <w:szCs w:val="16"/>
+          <w:lang w:val="en-US" w:eastAsia="ru-RU"/>
+        </w:rPr>
+        <w:t xml:space="preserve"> = 0, </w:t>
+      </w:r>
+      <w:proofErr w:type="spellStart"/>
+      <w:r>
+        <w:rPr>
+          <w:rFonts w:ascii="Consolas" w:eastAsia="Times New Roman" w:hAnsi="Consolas" w:cs="Times New Roman"/>
+          <w:color w:val="CCCCCC"/>
+          <w:sz w:val="16"/>
+          <w:szCs w:val="16"/>
+          <w:lang w:val="en-US" w:eastAsia="ru-RU"/>
+        </w:rPr>
+        <w:t>sizeValue</w:t>
+      </w:r>
+      <w:proofErr w:type="spellEnd"/>
+      <w:r>
+        <w:rPr>
+          <w:rFonts w:ascii="Consolas" w:eastAsia="Times New Roman" w:hAnsi="Consolas" w:cs="Times New Roman"/>
+          <w:color w:val="CCCCCC"/>
+          <w:sz w:val="16"/>
+          <w:szCs w:val="16"/>
+          <w:lang w:val="en-US" w:eastAsia="ru-RU"/>
+        </w:rPr>
+        <w:t xml:space="preserve"> = start; </w:t>
+      </w:r>
+      <w:proofErr w:type="spellStart"/>
+      <w:r>
+        <w:rPr>
+          <w:rFonts w:ascii="Consolas" w:eastAsia="Times New Roman" w:hAnsi="Consolas" w:cs="Times New Roman"/>
+          <w:color w:val="CCCCCC"/>
+          <w:sz w:val="16"/>
+          <w:szCs w:val="16"/>
+          <w:lang w:val="en-US" w:eastAsia="ru-RU"/>
+        </w:rPr>
+        <w:t>sizeValue</w:t>
+      </w:r>
+      <w:proofErr w:type="spellEnd"/>
+      <w:r>
+        <w:rPr>
+          <w:rFonts w:ascii="Consolas" w:eastAsia="Times New Roman" w:hAnsi="Consolas" w:cs="Times New Roman"/>
+          <w:color w:val="CCCCCC"/>
+          <w:sz w:val="16"/>
+          <w:szCs w:val="16"/>
+          <w:lang w:val="en-US" w:eastAsia="ru-RU"/>
+        </w:rPr>
+        <w:t xml:space="preserve"> &lt;= end; </w:t>
+      </w:r>
+      <w:proofErr w:type="spellStart"/>
+      <w:r>
+        <w:rPr>
+          <w:rFonts w:ascii="Consolas" w:eastAsia="Times New Roman" w:hAnsi="Consolas" w:cs="Times New Roman"/>
+          <w:color w:val="CCCCCC"/>
+          <w:sz w:val="16"/>
+          <w:szCs w:val="16"/>
+          <w:lang w:val="en-US" w:eastAsia="ru-RU"/>
+        </w:rPr>
+        <w:t>sizeValue</w:t>
+      </w:r>
+      <w:proofErr w:type="spellEnd"/>
+      <w:r>
+        <w:rPr>
+          <w:rFonts w:ascii="Consolas" w:eastAsia="Times New Roman" w:hAnsi="Consolas" w:cs="Times New Roman"/>
+          <w:color w:val="CCCCCC"/>
+          <w:sz w:val="16"/>
+          <w:szCs w:val="16"/>
+          <w:lang w:val="en-US" w:eastAsia="ru-RU"/>
+        </w:rPr>
+        <w:t xml:space="preserve"> += step, </w:t>
+      </w:r>
+      <w:proofErr w:type="spellStart"/>
+      <w:r>
+        <w:rPr>
+          <w:rFonts w:ascii="Consolas" w:eastAsia="Times New Roman" w:hAnsi="Consolas" w:cs="Times New Roman"/>
+          <w:color w:val="CCCCCC"/>
+          <w:sz w:val="16"/>
+          <w:szCs w:val="16"/>
+          <w:lang w:val="en-US" w:eastAsia="ru-RU"/>
+        </w:rPr>
+        <w:t>i</w:t>
+      </w:r>
+      <w:proofErr w:type="spellEnd"/>
+      <w:r>
+        <w:rPr>
+          <w:rFonts w:ascii="Consolas" w:eastAsia="Times New Roman" w:hAnsi="Consolas" w:cs="Times New Roman"/>
+          <w:color w:val="CCCCCC"/>
+          <w:sz w:val="16"/>
+          <w:szCs w:val="16"/>
+          <w:lang w:val="en-US" w:eastAsia="ru-RU"/>
+        </w:rPr>
+        <w:t>++) {</w:t>
+      </w:r>
     </w:p>
     <w:p>
       <w:pPr>
@@ -12486,19 +12132,20 @@
           <w:szCs w:val="16"/>
           <w:lang w:val="en-US" w:eastAsia="ru-RU"/>
         </w:rPr>
-        <w:t xml:space="preserve">        </w:t>
+        <w:t xml:space="preserve">            </w:t>
       </w:r>
       <w:proofErr w:type="spellStart"/>
       <w:r>
         <w:rPr>
           <w:rFonts w:ascii="Consolas" w:eastAsia="Times New Roman" w:hAnsi="Consolas" w:cs="Times New Roman"/>
-          <w:color w:val="4EC9B0"/>
+          <w:color w:val="CCCCCC"/>
           <w:sz w:val="16"/>
           <w:szCs w:val="16"/>
           <w:lang w:eastAsia="ru-RU"/>
         </w:rPr>
-        <w:t>System</w:t>
-      </w:r>
+        <w:t>sizes</w:t>
+      </w:r>
+      <w:proofErr w:type="spellEnd"/>
       <w:r>
         <w:rPr>
           <w:rFonts w:ascii="Consolas" w:eastAsia="Times New Roman" w:hAnsi="Consolas" w:cs="Times New Roman"/>
@@ -12507,18 +12154,20 @@
           <w:szCs w:val="16"/>
           <w:lang w:eastAsia="ru-RU"/>
         </w:rPr>
-        <w:t>.</w:t>
-      </w:r>
-      <w:r>
-        <w:rPr>
-          <w:rFonts w:ascii="Consolas" w:eastAsia="Times New Roman" w:hAnsi="Consolas" w:cs="Times New Roman"/>
-          <w:color w:val="4FC1FF"/>
+        <w:t xml:space="preserve">[i] = </w:t>
+      </w:r>
+      <w:proofErr w:type="spellStart"/>
+      <w:r>
+        <w:rPr>
+          <w:rFonts w:ascii="Consolas" w:eastAsia="Times New Roman" w:hAnsi="Consolas" w:cs="Times New Roman"/>
+          <w:color w:val="CCCCCC"/>
           <w:sz w:val="16"/>
           <w:szCs w:val="16"/>
           <w:lang w:eastAsia="ru-RU"/>
         </w:rPr>
-        <w:t>out</w:t>
-      </w:r>
+        <w:t>sizeValue</w:t>
+      </w:r>
+      <w:proofErr w:type="spellEnd"/>
       <w:r>
         <w:rPr>
           <w:rFonts w:ascii="Consolas" w:eastAsia="Times New Roman" w:hAnsi="Consolas" w:cs="Times New Roman"/>
@@ -12527,48 +12176,7 @@
           <w:szCs w:val="16"/>
           <w:lang w:eastAsia="ru-RU"/>
         </w:rPr>
-        <w:t>.</w:t>
-      </w:r>
-      <w:r>
-        <w:rPr>
-          <w:rFonts w:ascii="Consolas" w:eastAsia="Times New Roman" w:hAnsi="Consolas" w:cs="Times New Roman"/>
-          <w:color w:val="DCDCAA"/>
-          <w:sz w:val="16"/>
-          <w:szCs w:val="16"/>
-          <w:lang w:eastAsia="ru-RU"/>
-        </w:rPr>
-        <w:t>println</w:t>
-      </w:r>
-      <w:proofErr w:type="spellEnd"/>
-      <w:r>
-        <w:rPr>
-          <w:rFonts w:ascii="Consolas" w:eastAsia="Times New Roman" w:hAnsi="Consolas" w:cs="Times New Roman"/>
-          <w:color w:val="CCCCCC"/>
-          <w:sz w:val="16"/>
-          <w:szCs w:val="16"/>
-          <w:lang w:eastAsia="ru-RU"/>
-        </w:rPr>
-        <w:t>(</w:t>
-      </w:r>
-      <w:r>
-        <w:rPr>
-          <w:rFonts w:ascii="Consolas" w:eastAsia="Times New Roman" w:hAnsi="Consolas" w:cs="Times New Roman"/>
-          <w:color w:val="CE9178"/>
-          <w:sz w:val="16"/>
-          <w:szCs w:val="16"/>
-          <w:lang w:eastAsia="ru-RU"/>
-        </w:rPr>
-        <w:t>"===== Добавление элементов ====="</w:t>
-      </w:r>
-      <w:r>
-        <w:rPr>
-          <w:rFonts w:ascii="Consolas" w:eastAsia="Times New Roman" w:hAnsi="Consolas" w:cs="Times New Roman"/>
-          <w:color w:val="CCCCCC"/>
-          <w:sz w:val="16"/>
-          <w:szCs w:val="16"/>
-          <w:lang w:eastAsia="ru-RU"/>
-        </w:rPr>
-        <w:t>);</w:t>
+        <w:t>;</w:t>
       </w:r>
     </w:p>
     <w:p>
@@ -12580,120 +12188,18 @@
           <w:color w:val="CCCCCC"/>
           <w:sz w:val="16"/>
           <w:szCs w:val="16"/>
-          <w:lang w:val="en-US" w:eastAsia="ru-RU"/>
-        </w:rPr>
-      </w:pPr>
-      <w:r>
-        <w:rPr>
-          <w:rFonts w:ascii="Consolas" w:eastAsia="Times New Roman" w:hAnsi="Consolas" w:cs="Times New Roman"/>
-          <w:color w:val="CCCCCC"/>
-          <w:sz w:val="16"/>
-          <w:szCs w:val="16"/>
           <w:lang w:eastAsia="ru-RU"/>
         </w:rPr>
-        <w:t xml:space="preserve">        </w:t>
-      </w:r>
-      <w:r>
-        <w:rPr>
-          <w:rFonts w:ascii="Consolas" w:eastAsia="Times New Roman" w:hAnsi="Consolas" w:cs="Times New Roman"/>
-          <w:color w:val="C586C0"/>
-          <w:sz w:val="16"/>
-          <w:szCs w:val="16"/>
-          <w:lang w:val="en-US" w:eastAsia="ru-RU"/>
-        </w:rPr>
-        <w:t>for</w:t>
-      </w:r>
-      <w:r>
-        <w:rPr>
-          <w:rFonts w:ascii="Consolas" w:eastAsia="Times New Roman" w:hAnsi="Consolas" w:cs="Times New Roman"/>
-          <w:color w:val="CCCCCC"/>
-          <w:sz w:val="16"/>
-          <w:szCs w:val="16"/>
-          <w:lang w:val="en-US" w:eastAsia="ru-RU"/>
-        </w:rPr>
-        <w:t xml:space="preserve"> (</w:t>
-      </w:r>
-      <w:r>
-        <w:rPr>
-          <w:rFonts w:ascii="Consolas" w:eastAsia="Times New Roman" w:hAnsi="Consolas" w:cs="Times New Roman"/>
-          <w:color w:val="4EC9B0"/>
-          <w:sz w:val="16"/>
-          <w:szCs w:val="16"/>
-          <w:lang w:val="en-US" w:eastAsia="ru-RU"/>
-        </w:rPr>
-        <w:t>int</w:t>
-      </w:r>
-      <w:r>
-        <w:rPr>
-          <w:rFonts w:ascii="Consolas" w:eastAsia="Times New Roman" w:hAnsi="Consolas" w:cs="Times New Roman"/>
-          <w:color w:val="CCCCCC"/>
-          <w:sz w:val="16"/>
-          <w:szCs w:val="16"/>
-          <w:lang w:val="en-US" w:eastAsia="ru-RU"/>
-        </w:rPr>
-        <w:t xml:space="preserve"> </w:t>
-      </w:r>
-      <w:proofErr w:type="gramStart"/>
-      <w:r>
-        <w:rPr>
-          <w:rFonts w:ascii="Consolas" w:eastAsia="Times New Roman" w:hAnsi="Consolas" w:cs="Times New Roman"/>
-          <w:color w:val="9CDCFE"/>
-          <w:sz w:val="16"/>
-          <w:szCs w:val="16"/>
-          <w:lang w:val="en-US" w:eastAsia="ru-RU"/>
-        </w:rPr>
-        <w:t>size</w:t>
-      </w:r>
-      <w:r>
-        <w:rPr>
-          <w:rFonts w:ascii="Consolas" w:eastAsia="Times New Roman" w:hAnsi="Consolas" w:cs="Times New Roman"/>
-          <w:color w:val="CCCCCC"/>
-          <w:sz w:val="16"/>
-          <w:szCs w:val="16"/>
-          <w:lang w:val="en-US" w:eastAsia="ru-RU"/>
-        </w:rPr>
-        <w:t xml:space="preserve"> </w:t>
-      </w:r>
-      <w:r>
-        <w:rPr>
-          <w:rFonts w:ascii="Consolas" w:eastAsia="Times New Roman" w:hAnsi="Consolas" w:cs="Times New Roman"/>
-          <w:color w:val="C586C0"/>
-          <w:sz w:val="16"/>
-          <w:szCs w:val="16"/>
-          <w:lang w:val="en-US" w:eastAsia="ru-RU"/>
-        </w:rPr>
-        <w:t>:</w:t>
-      </w:r>
-      <w:proofErr w:type="gramEnd"/>
-      <w:r>
-        <w:rPr>
-          <w:rFonts w:ascii="Consolas" w:eastAsia="Times New Roman" w:hAnsi="Consolas" w:cs="Times New Roman"/>
-          <w:color w:val="CCCCCC"/>
-          <w:sz w:val="16"/>
-          <w:szCs w:val="16"/>
-          <w:lang w:val="en-US" w:eastAsia="ru-RU"/>
-        </w:rPr>
-        <w:t xml:space="preserve"> </w:t>
-      </w:r>
-      <w:r>
-        <w:rPr>
-          <w:rFonts w:ascii="Consolas" w:eastAsia="Times New Roman" w:hAnsi="Consolas" w:cs="Times New Roman"/>
-          <w:color w:val="9CDCFE"/>
-          <w:sz w:val="16"/>
-          <w:szCs w:val="16"/>
-          <w:lang w:val="en-US" w:eastAsia="ru-RU"/>
-        </w:rPr>
-        <w:t>sizes</w:t>
-      </w:r>
-      <w:r>
-        <w:rPr>
-          <w:rFonts w:ascii="Consolas" w:eastAsia="Times New Roman" w:hAnsi="Consolas" w:cs="Times New Roman"/>
-          <w:color w:val="CCCCCC"/>
-          <w:sz w:val="16"/>
-          <w:szCs w:val="16"/>
-          <w:lang w:val="en-US" w:eastAsia="ru-RU"/>
-        </w:rPr>
-        <w:t>) {</w:t>
+      </w:pPr>
+      <w:r>
+        <w:rPr>
+          <w:rFonts w:ascii="Consolas" w:eastAsia="Times New Roman" w:hAnsi="Consolas" w:cs="Times New Roman"/>
+          <w:color w:val="CCCCCC"/>
+          <w:sz w:val="16"/>
+          <w:szCs w:val="16"/>
+          <w:lang w:eastAsia="ru-RU"/>
+        </w:rPr>
+        <w:t>        }</w:t>
       </w:r>
     </w:p>
     <w:p>
@@ -12708,58 +12214,6 @@
           <w:lang w:val="en-US" w:eastAsia="ru-RU"/>
         </w:rPr>
       </w:pPr>
-      <w:r>
-        <w:rPr>
-          <w:rFonts w:ascii="Consolas" w:eastAsia="Times New Roman" w:hAnsi="Consolas" w:cs="Times New Roman"/>
-          <w:color w:val="CCCCCC"/>
-          <w:sz w:val="16"/>
-          <w:szCs w:val="16"/>
-          <w:lang w:val="en-US" w:eastAsia="ru-RU"/>
-        </w:rPr>
-        <w:t xml:space="preserve">            </w:t>
-      </w:r>
-      <w:proofErr w:type="spellStart"/>
-      <w:r>
-        <w:rPr>
-          <w:rFonts w:ascii="Consolas" w:eastAsia="Times New Roman" w:hAnsi="Consolas" w:cs="Times New Roman"/>
-          <w:color w:val="9CDCFE"/>
-          <w:sz w:val="16"/>
-          <w:szCs w:val="16"/>
-          <w:lang w:val="en-US" w:eastAsia="ru-RU"/>
-        </w:rPr>
-        <w:t>hashSet</w:t>
-      </w:r>
-      <w:r>
-        <w:rPr>
-          <w:rFonts w:ascii="Consolas" w:eastAsia="Times New Roman" w:hAnsi="Consolas" w:cs="Times New Roman"/>
-          <w:color w:val="CCCCCC"/>
-          <w:sz w:val="16"/>
-          <w:szCs w:val="16"/>
-          <w:lang w:val="en-US" w:eastAsia="ru-RU"/>
-        </w:rPr>
-        <w:t>.</w:t>
-      </w:r>
-      <w:r>
-        <w:rPr>
-          <w:rFonts w:ascii="Consolas" w:eastAsia="Times New Roman" w:hAnsi="Consolas" w:cs="Times New Roman"/>
-          <w:color w:val="DCDCAA"/>
-          <w:sz w:val="16"/>
-          <w:szCs w:val="16"/>
-          <w:lang w:val="en-US" w:eastAsia="ru-RU"/>
-        </w:rPr>
-        <w:t>clear</w:t>
-      </w:r>
-      <w:proofErr w:type="spellEnd"/>
-      <w:r>
-        <w:rPr>
-          <w:rFonts w:ascii="Consolas" w:eastAsia="Times New Roman" w:hAnsi="Consolas" w:cs="Times New Roman"/>
-          <w:color w:val="CCCCCC"/>
-          <w:sz w:val="16"/>
-          <w:szCs w:val="16"/>
-          <w:lang w:val="en-US" w:eastAsia="ru-RU"/>
-        </w:rPr>
-        <w:t>();</w:t>
-      </w:r>
     </w:p>
     <w:p>
       <w:pPr>
@@ -12781,7 +12235,27 @@
           <w:szCs w:val="16"/>
           <w:lang w:val="en-US" w:eastAsia="ru-RU"/>
         </w:rPr>
-        <w:t xml:space="preserve">            </w:t>
+        <w:t xml:space="preserve">        </w:t>
+      </w:r>
+      <w:r>
+        <w:rPr>
+          <w:rFonts w:ascii="Consolas" w:eastAsia="Times New Roman" w:hAnsi="Consolas" w:cs="Times New Roman"/>
+          <w:color w:val="4EC9B0"/>
+          <w:sz w:val="16"/>
+          <w:szCs w:val="16"/>
+          <w:lang w:val="en-US" w:eastAsia="ru-RU"/>
+        </w:rPr>
+        <w:t>int</w:t>
+      </w:r>
+      <w:r>
+        <w:rPr>
+          <w:rFonts w:ascii="Consolas" w:eastAsia="Times New Roman" w:hAnsi="Consolas" w:cs="Times New Roman"/>
+          <w:color w:val="CCCCCC"/>
+          <w:sz w:val="16"/>
+          <w:szCs w:val="16"/>
+          <w:lang w:val="en-US" w:eastAsia="ru-RU"/>
+        </w:rPr>
+        <w:t xml:space="preserve"> </w:t>
       </w:r>
       <w:proofErr w:type="spellStart"/>
       <w:r>
@@ -12792,27 +12266,7 @@
           <w:szCs w:val="16"/>
           <w:lang w:val="en-US" w:eastAsia="ru-RU"/>
         </w:rPr>
-        <w:t>linkedList</w:t>
-      </w:r>
-      <w:r>
-        <w:rPr>
-          <w:rFonts w:ascii="Consolas" w:eastAsia="Times New Roman" w:hAnsi="Consolas" w:cs="Times New Roman"/>
-          <w:color w:val="CCCCCC"/>
-          <w:sz w:val="16"/>
-          <w:szCs w:val="16"/>
-          <w:lang w:val="en-US" w:eastAsia="ru-RU"/>
-        </w:rPr>
-        <w:t>.</w:t>
-      </w:r>
-      <w:r>
-        <w:rPr>
-          <w:rFonts w:ascii="Consolas" w:eastAsia="Times New Roman" w:hAnsi="Consolas" w:cs="Times New Roman"/>
-          <w:color w:val="DCDCAA"/>
-          <w:sz w:val="16"/>
-          <w:szCs w:val="16"/>
-          <w:lang w:val="en-US" w:eastAsia="ru-RU"/>
-        </w:rPr>
-        <w:t>clear</w:t>
+        <w:t>numberOfSearches</w:t>
       </w:r>
       <w:proofErr w:type="spellEnd"/>
       <w:r>
@@ -12823,7 +12277,47 @@
           <w:szCs w:val="16"/>
           <w:lang w:val="en-US" w:eastAsia="ru-RU"/>
         </w:rPr>
-        <w:t>();</w:t>
+        <w:t xml:space="preserve"> </w:t>
+      </w:r>
+      <w:r>
+        <w:rPr>
+          <w:rFonts w:ascii="Consolas" w:eastAsia="Times New Roman" w:hAnsi="Consolas" w:cs="Times New Roman"/>
+          <w:color w:val="D4D4D4"/>
+          <w:sz w:val="16"/>
+          <w:szCs w:val="16"/>
+          <w:lang w:val="en-US" w:eastAsia="ru-RU"/>
+        </w:rPr>
+        <w:t>=</w:t>
+      </w:r>
+      <w:r>
+        <w:rPr>
+          <w:rFonts w:ascii="Consolas" w:eastAsia="Times New Roman" w:hAnsi="Consolas" w:cs="Times New Roman"/>
+          <w:color w:val="CCCCCC"/>
+          <w:sz w:val="16"/>
+          <w:szCs w:val="16"/>
+          <w:lang w:val="en-US" w:eastAsia="ru-RU"/>
+        </w:rPr>
+        <w:t xml:space="preserve"> </w:t>
+      </w:r>
+      <w:r>
+        <w:rPr>
+          <w:rFonts w:ascii="Consolas" w:eastAsia="Times New Roman" w:hAnsi="Consolas" w:cs="Times New Roman"/>
+          <w:color w:val="B5CEA8"/>
+          <w:sz w:val="16"/>
+          <w:szCs w:val="16"/>
+          <w:lang w:val="en-US" w:eastAsia="ru-RU"/>
+        </w:rPr>
+        <w:t>100000</w:t>
+      </w:r>
+      <w:r>
+        <w:rPr>
+          <w:rFonts w:ascii="Consolas" w:eastAsia="Times New Roman" w:hAnsi="Consolas" w:cs="Times New Roman"/>
+          <w:color w:val="CCCCCC"/>
+          <w:sz w:val="16"/>
+          <w:szCs w:val="16"/>
+          <w:lang w:val="en-US" w:eastAsia="ru-RU"/>
+        </w:rPr>
+        <w:t>;</w:t>
       </w:r>
     </w:p>
     <w:p>
@@ -12838,138 +12332,6 @@
           <w:lang w:val="en-US" w:eastAsia="ru-RU"/>
         </w:rPr>
       </w:pPr>
-      <w:r>
-        <w:rPr>
-          <w:rFonts w:ascii="Consolas" w:eastAsia="Times New Roman" w:hAnsi="Consolas" w:cs="Times New Roman"/>
-          <w:color w:val="CCCCCC"/>
-          <w:sz w:val="16"/>
-          <w:szCs w:val="16"/>
-          <w:lang w:val="en-US" w:eastAsia="ru-RU"/>
-        </w:rPr>
-        <w:t xml:space="preserve">            </w:t>
-      </w:r>
-      <w:proofErr w:type="spellStart"/>
-      <w:r>
-        <w:rPr>
-          <w:rFonts w:ascii="Consolas" w:eastAsia="Times New Roman" w:hAnsi="Consolas" w:cs="Times New Roman"/>
-          <w:color w:val="4EC9B0"/>
-          <w:sz w:val="16"/>
-          <w:szCs w:val="16"/>
-          <w:lang w:val="en-US" w:eastAsia="ru-RU"/>
-        </w:rPr>
-        <w:t>System</w:t>
-      </w:r>
-      <w:r>
-        <w:rPr>
-          <w:rFonts w:ascii="Consolas" w:eastAsia="Times New Roman" w:hAnsi="Consolas" w:cs="Times New Roman"/>
-          <w:color w:val="CCCCCC"/>
-          <w:sz w:val="16"/>
-          <w:szCs w:val="16"/>
-          <w:lang w:val="en-US" w:eastAsia="ru-RU"/>
-        </w:rPr>
-        <w:t>.</w:t>
-      </w:r>
-      <w:r>
-        <w:rPr>
-          <w:rFonts w:ascii="Consolas" w:eastAsia="Times New Roman" w:hAnsi="Consolas" w:cs="Times New Roman"/>
-          <w:color w:val="4FC1FF"/>
-          <w:sz w:val="16"/>
-          <w:szCs w:val="16"/>
-          <w:lang w:val="en-US" w:eastAsia="ru-RU"/>
-        </w:rPr>
-        <w:t>out</w:t>
-      </w:r>
-      <w:r>
-        <w:rPr>
-          <w:rFonts w:ascii="Consolas" w:eastAsia="Times New Roman" w:hAnsi="Consolas" w:cs="Times New Roman"/>
-          <w:color w:val="CCCCCC"/>
-          <w:sz w:val="16"/>
-          <w:szCs w:val="16"/>
-          <w:lang w:val="en-US" w:eastAsia="ru-RU"/>
-        </w:rPr>
-        <w:t>.</w:t>
-      </w:r>
-      <w:r>
-        <w:rPr>
-          <w:rFonts w:ascii="Consolas" w:eastAsia="Times New Roman" w:hAnsi="Consolas" w:cs="Times New Roman"/>
-          <w:color w:val="DCDCAA"/>
-          <w:sz w:val="16"/>
-          <w:szCs w:val="16"/>
-          <w:lang w:val="en-US" w:eastAsia="ru-RU"/>
-        </w:rPr>
-        <w:t>println</w:t>
-      </w:r>
-      <w:proofErr w:type="spellEnd"/>
-      <w:r>
-        <w:rPr>
-          <w:rFonts w:ascii="Consolas" w:eastAsia="Times New Roman" w:hAnsi="Consolas" w:cs="Times New Roman"/>
-          <w:color w:val="CCCCCC"/>
-          <w:sz w:val="16"/>
-          <w:szCs w:val="16"/>
-          <w:lang w:val="en-US" w:eastAsia="ru-RU"/>
-        </w:rPr>
-        <w:t>(</w:t>
-      </w:r>
-      <w:r>
-        <w:rPr>
-          <w:rFonts w:ascii="Consolas" w:eastAsia="Times New Roman" w:hAnsi="Consolas" w:cs="Times New Roman"/>
-          <w:color w:val="CE9178"/>
-          <w:sz w:val="16"/>
-          <w:szCs w:val="16"/>
-          <w:lang w:val="en-US" w:eastAsia="ru-RU"/>
-        </w:rPr>
-        <w:t>"n = "</w:t>
-      </w:r>
-      <w:r>
-        <w:rPr>
-          <w:rFonts w:ascii="Consolas" w:eastAsia="Times New Roman" w:hAnsi="Consolas" w:cs="Times New Roman"/>
-          <w:color w:val="CCCCCC"/>
-          <w:sz w:val="16"/>
-          <w:szCs w:val="16"/>
-          <w:lang w:val="en-US" w:eastAsia="ru-RU"/>
-        </w:rPr>
-        <w:t xml:space="preserve"> </w:t>
-      </w:r>
-      <w:r>
-        <w:rPr>
-          <w:rFonts w:ascii="Consolas" w:eastAsia="Times New Roman" w:hAnsi="Consolas" w:cs="Times New Roman"/>
-          <w:color w:val="D4D4D4"/>
-          <w:sz w:val="16"/>
-          <w:szCs w:val="16"/>
-          <w:lang w:val="en-US" w:eastAsia="ru-RU"/>
-        </w:rPr>
-        <w:t>+</w:t>
-      </w:r>
-      <w:r>
-        <w:rPr>
-          <w:rFonts w:ascii="Consolas" w:eastAsia="Times New Roman" w:hAnsi="Consolas" w:cs="Times New Roman"/>
-          <w:color w:val="CCCCCC"/>
-          <w:sz w:val="16"/>
-          <w:szCs w:val="16"/>
-          <w:lang w:val="en-US" w:eastAsia="ru-RU"/>
-        </w:rPr>
-        <w:t xml:space="preserve"> </w:t>
-      </w:r>
-      <w:r>
-        <w:rPr>
-          <w:rFonts w:ascii="Consolas" w:eastAsia="Times New Roman" w:hAnsi="Consolas" w:cs="Times New Roman"/>
-          <w:color w:val="9CDCFE"/>
-          <w:sz w:val="16"/>
-          <w:szCs w:val="16"/>
-          <w:lang w:val="en-US" w:eastAsia="ru-RU"/>
-        </w:rPr>
-        <w:t>size</w:t>
-      </w:r>
-      <w:r>
-        <w:rPr>
-          <w:rFonts w:ascii="Consolas" w:eastAsia="Times New Roman" w:hAnsi="Consolas" w:cs="Times New Roman"/>
-          <w:color w:val="CCCCCC"/>
-          <w:sz w:val="16"/>
-          <w:szCs w:val="16"/>
-          <w:lang w:val="en-US" w:eastAsia="ru-RU"/>
-        </w:rPr>
-        <w:t>);</w:t>
-      </w:r>
     </w:p>
     <w:p>
       <w:pPr>
@@ -12980,9 +12342,101 @@
           <w:color w:val="CCCCCC"/>
           <w:sz w:val="16"/>
           <w:szCs w:val="16"/>
-          <w:lang w:val="en-US" w:eastAsia="ru-RU"/>
-        </w:rPr>
-      </w:pPr>
+          <w:lang w:eastAsia="ru-RU"/>
+        </w:rPr>
+      </w:pPr>
+      <w:r>
+        <w:rPr>
+          <w:rFonts w:ascii="Consolas" w:eastAsia="Times New Roman" w:hAnsi="Consolas" w:cs="Times New Roman"/>
+          <w:color w:val="CCCCCC"/>
+          <w:sz w:val="16"/>
+          <w:szCs w:val="16"/>
+          <w:lang w:val="en-US" w:eastAsia="ru-RU"/>
+        </w:rPr>
+        <w:t xml:space="preserve">        </w:t>
+      </w:r>
+      <w:proofErr w:type="spellStart"/>
+      <w:r>
+        <w:rPr>
+          <w:rFonts w:ascii="Consolas" w:eastAsia="Times New Roman" w:hAnsi="Consolas" w:cs="Times New Roman"/>
+          <w:color w:val="4EC9B0"/>
+          <w:sz w:val="16"/>
+          <w:szCs w:val="16"/>
+          <w:lang w:eastAsia="ru-RU"/>
+        </w:rPr>
+        <w:t>System</w:t>
+      </w:r>
+      <w:r>
+        <w:rPr>
+          <w:rFonts w:ascii="Consolas" w:eastAsia="Times New Roman" w:hAnsi="Consolas" w:cs="Times New Roman"/>
+          <w:color w:val="CCCCCC"/>
+          <w:sz w:val="16"/>
+          <w:szCs w:val="16"/>
+          <w:lang w:eastAsia="ru-RU"/>
+        </w:rPr>
+        <w:t>.</w:t>
+      </w:r>
+      <w:r>
+        <w:rPr>
+          <w:rFonts w:ascii="Consolas" w:eastAsia="Times New Roman" w:hAnsi="Consolas" w:cs="Times New Roman"/>
+          <w:color w:val="4FC1FF"/>
+          <w:sz w:val="16"/>
+          <w:szCs w:val="16"/>
+          <w:lang w:eastAsia="ru-RU"/>
+        </w:rPr>
+        <w:t>out</w:t>
+      </w:r>
+      <w:r>
+        <w:rPr>
+          <w:rFonts w:ascii="Consolas" w:eastAsia="Times New Roman" w:hAnsi="Consolas" w:cs="Times New Roman"/>
+          <w:color w:val="CCCCCC"/>
+          <w:sz w:val="16"/>
+          <w:szCs w:val="16"/>
+          <w:lang w:eastAsia="ru-RU"/>
+        </w:rPr>
+        <w:t>.</w:t>
+      </w:r>
+      <w:r>
+        <w:rPr>
+          <w:rFonts w:ascii="Consolas" w:eastAsia="Times New Roman" w:hAnsi="Consolas" w:cs="Times New Roman"/>
+          <w:color w:val="DCDCAA"/>
+          <w:sz w:val="16"/>
+          <w:szCs w:val="16"/>
+          <w:lang w:eastAsia="ru-RU"/>
+        </w:rPr>
+        <w:t>println</w:t>
+      </w:r>
+      <w:proofErr w:type="spellEnd"/>
+      <w:r>
+        <w:rPr>
+          <w:rFonts w:ascii="Consolas" w:eastAsia="Times New Roman" w:hAnsi="Consolas" w:cs="Times New Roman"/>
+          <w:color w:val="CCCCCC"/>
+          <w:sz w:val="16"/>
+          <w:szCs w:val="16"/>
+          <w:lang w:eastAsia="ru-RU"/>
+        </w:rPr>
+        <w:t>(</w:t>
+      </w:r>
+      <w:r>
+        <w:rPr>
+          <w:rFonts w:ascii="Consolas" w:eastAsia="Times New Roman" w:hAnsi="Consolas" w:cs="Times New Roman"/>
+          <w:color w:val="CE9178"/>
+          <w:sz w:val="16"/>
+          <w:szCs w:val="16"/>
+          <w:lang w:eastAsia="ru-RU"/>
+        </w:rPr>
+        <w:t>"===== Добавление элементов ====="</w:t>
+      </w:r>
+      <w:r>
+        <w:rPr>
+          <w:rFonts w:ascii="Consolas" w:eastAsia="Times New Roman" w:hAnsi="Consolas" w:cs="Times New Roman"/>
+          <w:color w:val="CCCCCC"/>
+          <w:sz w:val="16"/>
+          <w:szCs w:val="16"/>
+          <w:lang w:eastAsia="ru-RU"/>
+        </w:rPr>
+        <w:t>);</w:t>
+      </w:r>
     </w:p>
     <w:p>
       <w:pPr>
@@ -13002,59 +12456,111 @@
           <w:color w:val="CCCCCC"/>
           <w:sz w:val="16"/>
           <w:szCs w:val="16"/>
-          <w:lang w:val="en-US" w:eastAsia="ru-RU"/>
-        </w:rPr>
-        <w:t xml:space="preserve">            </w:t>
-      </w:r>
-      <w:r>
-        <w:rPr>
-          <w:rFonts w:ascii="Consolas" w:eastAsia="Times New Roman" w:hAnsi="Consolas" w:cs="Times New Roman"/>
-          <w:color w:val="6A9955"/>
-          <w:sz w:val="16"/>
-          <w:szCs w:val="16"/>
-          <w:lang w:val="en-US" w:eastAsia="ru-RU"/>
-        </w:rPr>
-        <w:t xml:space="preserve">// </w:t>
-      </w:r>
-      <w:r>
-        <w:rPr>
-          <w:rFonts w:ascii="Consolas" w:eastAsia="Times New Roman" w:hAnsi="Consolas" w:cs="Times New Roman"/>
-          <w:color w:val="6A9955"/>
-          <w:sz w:val="16"/>
-          <w:szCs w:val="16"/>
           <w:lang w:eastAsia="ru-RU"/>
         </w:rPr>
-        <w:t>Добавление</w:t>
-      </w:r>
-      <w:r>
-        <w:rPr>
-          <w:rFonts w:ascii="Consolas" w:eastAsia="Times New Roman" w:hAnsi="Consolas" w:cs="Times New Roman"/>
-          <w:color w:val="6A9955"/>
+        <w:t xml:space="preserve">        </w:t>
+      </w:r>
+      <w:r>
+        <w:rPr>
+          <w:rFonts w:ascii="Consolas" w:eastAsia="Times New Roman" w:hAnsi="Consolas" w:cs="Times New Roman"/>
+          <w:color w:val="C586C0"/>
+          <w:sz w:val="16"/>
+          <w:szCs w:val="16"/>
+          <w:lang w:val="en-US" w:eastAsia="ru-RU"/>
+        </w:rPr>
+        <w:t>for</w:t>
+      </w:r>
+      <w:r>
+        <w:rPr>
+          <w:rFonts w:ascii="Consolas" w:eastAsia="Times New Roman" w:hAnsi="Consolas" w:cs="Times New Roman"/>
+          <w:color w:val="CCCCCC"/>
+          <w:sz w:val="16"/>
+          <w:szCs w:val="16"/>
+          <w:lang w:val="en-US" w:eastAsia="ru-RU"/>
+        </w:rPr>
+        <w:t xml:space="preserve"> (</w:t>
+      </w:r>
+      <w:r>
+        <w:rPr>
+          <w:rFonts w:ascii="Consolas" w:eastAsia="Times New Roman" w:hAnsi="Consolas" w:cs="Times New Roman"/>
+          <w:color w:val="4EC9B0"/>
+          <w:sz w:val="16"/>
+          <w:szCs w:val="16"/>
+          <w:lang w:val="en-US" w:eastAsia="ru-RU"/>
+        </w:rPr>
+        <w:t>int</w:t>
+      </w:r>
+      <w:r>
+        <w:rPr>
+          <w:rFonts w:ascii="Consolas" w:eastAsia="Times New Roman" w:hAnsi="Consolas" w:cs="Times New Roman"/>
+          <w:color w:val="CCCCCC"/>
           <w:sz w:val="16"/>
           <w:szCs w:val="16"/>
           <w:lang w:val="en-US" w:eastAsia="ru-RU"/>
         </w:rPr>
         <w:t xml:space="preserve"> </w:t>
       </w:r>
-      <w:r>
-        <w:rPr>
-          <w:rFonts w:ascii="Consolas" w:eastAsia="Times New Roman" w:hAnsi="Consolas" w:cs="Times New Roman"/>
-          <w:color w:val="6A9955"/>
-          <w:sz w:val="16"/>
-          <w:szCs w:val="16"/>
-          <w:lang w:eastAsia="ru-RU"/>
-        </w:rPr>
-        <w:t>в</w:t>
-      </w:r>
-      <w:r>
-        <w:rPr>
-          <w:rFonts w:ascii="Consolas" w:eastAsia="Times New Roman" w:hAnsi="Consolas" w:cs="Times New Roman"/>
-          <w:color w:val="6A9955"/>
-          <w:sz w:val="16"/>
-          <w:szCs w:val="16"/>
-          <w:lang w:val="en-US" w:eastAsia="ru-RU"/>
-        </w:rPr>
-        <w:t xml:space="preserve"> HashSet</w:t>
+      <w:proofErr w:type="gramStart"/>
+      <w:r>
+        <w:rPr>
+          <w:rFonts w:ascii="Consolas" w:eastAsia="Times New Roman" w:hAnsi="Consolas" w:cs="Times New Roman"/>
+          <w:color w:val="9CDCFE"/>
+          <w:sz w:val="16"/>
+          <w:szCs w:val="16"/>
+          <w:lang w:val="en-US" w:eastAsia="ru-RU"/>
+        </w:rPr>
+        <w:t>size</w:t>
+      </w:r>
+      <w:r>
+        <w:rPr>
+          <w:rFonts w:ascii="Consolas" w:eastAsia="Times New Roman" w:hAnsi="Consolas" w:cs="Times New Roman"/>
+          <w:color w:val="CCCCCC"/>
+          <w:sz w:val="16"/>
+          <w:szCs w:val="16"/>
+          <w:lang w:val="en-US" w:eastAsia="ru-RU"/>
+        </w:rPr>
+        <w:t xml:space="preserve"> </w:t>
+      </w:r>
+      <w:r>
+        <w:rPr>
+          <w:rFonts w:ascii="Consolas" w:eastAsia="Times New Roman" w:hAnsi="Consolas" w:cs="Times New Roman"/>
+          <w:color w:val="C586C0"/>
+          <w:sz w:val="16"/>
+          <w:szCs w:val="16"/>
+          <w:lang w:val="en-US" w:eastAsia="ru-RU"/>
+        </w:rPr>
+        <w:t>:</w:t>
+      </w:r>
+      <w:proofErr w:type="gramEnd"/>
+      <w:r>
+        <w:rPr>
+          <w:rFonts w:ascii="Consolas" w:eastAsia="Times New Roman" w:hAnsi="Consolas" w:cs="Times New Roman"/>
+          <w:color w:val="CCCCCC"/>
+          <w:sz w:val="16"/>
+          <w:szCs w:val="16"/>
+          <w:lang w:val="en-US" w:eastAsia="ru-RU"/>
+        </w:rPr>
+        <w:t xml:space="preserve"> </w:t>
+      </w:r>
+      <w:r>
+        <w:rPr>
+          <w:rFonts w:ascii="Consolas" w:eastAsia="Times New Roman" w:hAnsi="Consolas" w:cs="Times New Roman"/>
+          <w:color w:val="9CDCFE"/>
+          <w:sz w:val="16"/>
+          <w:szCs w:val="16"/>
+          <w:lang w:val="en-US" w:eastAsia="ru-RU"/>
+        </w:rPr>
+        <w:t>sizes</w:t>
+      </w:r>
+      <w:r>
+        <w:rPr>
+          <w:rFonts w:ascii="Consolas" w:eastAsia="Times New Roman" w:hAnsi="Consolas" w:cs="Times New Roman"/>
+          <w:color w:val="CCCCCC"/>
+          <w:sz w:val="16"/>
+          <w:szCs w:val="16"/>
+          <w:lang w:val="en-US" w:eastAsia="ru-RU"/>
+        </w:rPr>
+        <w:t>) {</w:t>
       </w:r>
     </w:p>
     <w:p>
@@ -13083,6 +12589,367 @@
       <w:r>
         <w:rPr>
           <w:rFonts w:ascii="Consolas" w:eastAsia="Times New Roman" w:hAnsi="Consolas" w:cs="Times New Roman"/>
+          <w:color w:val="9CDCFE"/>
+          <w:sz w:val="16"/>
+          <w:szCs w:val="16"/>
+          <w:lang w:val="en-US" w:eastAsia="ru-RU"/>
+        </w:rPr>
+        <w:t>hashSet</w:t>
+      </w:r>
+      <w:r>
+        <w:rPr>
+          <w:rFonts w:ascii="Consolas" w:eastAsia="Times New Roman" w:hAnsi="Consolas" w:cs="Times New Roman"/>
+          <w:color w:val="CCCCCC"/>
+          <w:sz w:val="16"/>
+          <w:szCs w:val="16"/>
+          <w:lang w:val="en-US" w:eastAsia="ru-RU"/>
+        </w:rPr>
+        <w:t>.</w:t>
+      </w:r>
+      <w:r>
+        <w:rPr>
+          <w:rFonts w:ascii="Consolas" w:eastAsia="Times New Roman" w:hAnsi="Consolas" w:cs="Times New Roman"/>
+          <w:color w:val="DCDCAA"/>
+          <w:sz w:val="16"/>
+          <w:szCs w:val="16"/>
+          <w:lang w:val="en-US" w:eastAsia="ru-RU"/>
+        </w:rPr>
+        <w:t>clear</w:t>
+      </w:r>
+      <w:proofErr w:type="spellEnd"/>
+      <w:r>
+        <w:rPr>
+          <w:rFonts w:ascii="Consolas" w:eastAsia="Times New Roman" w:hAnsi="Consolas" w:cs="Times New Roman"/>
+          <w:color w:val="CCCCCC"/>
+          <w:sz w:val="16"/>
+          <w:szCs w:val="16"/>
+          <w:lang w:val="en-US" w:eastAsia="ru-RU"/>
+        </w:rPr>
+        <w:t>();</w:t>
+      </w:r>
+    </w:p>
+    <w:p>
+      <w:pPr>
+        <w:shd w:val="clear" w:color="auto" w:fill="1F1F1F"/>
+        <w:spacing w:after="0" w:line="285" w:lineRule="atLeast"/>
+        <w:rPr>
+          <w:rFonts w:ascii="Consolas" w:eastAsia="Times New Roman" w:hAnsi="Consolas" w:cs="Times New Roman"/>
+          <w:color w:val="CCCCCC"/>
+          <w:sz w:val="16"/>
+          <w:szCs w:val="16"/>
+          <w:lang w:val="en-US" w:eastAsia="ru-RU"/>
+        </w:rPr>
+      </w:pPr>
+      <w:r>
+        <w:rPr>
+          <w:rFonts w:ascii="Consolas" w:eastAsia="Times New Roman" w:hAnsi="Consolas" w:cs="Times New Roman"/>
+          <w:color w:val="CCCCCC"/>
+          <w:sz w:val="16"/>
+          <w:szCs w:val="16"/>
+          <w:lang w:val="en-US" w:eastAsia="ru-RU"/>
+        </w:rPr>
+        <w:t xml:space="preserve">            </w:t>
+      </w:r>
+      <w:proofErr w:type="spellStart"/>
+      <w:r>
+        <w:rPr>
+          <w:rFonts w:ascii="Consolas" w:eastAsia="Times New Roman" w:hAnsi="Consolas" w:cs="Times New Roman"/>
+          <w:color w:val="9CDCFE"/>
+          <w:sz w:val="16"/>
+          <w:szCs w:val="16"/>
+          <w:lang w:val="en-US" w:eastAsia="ru-RU"/>
+        </w:rPr>
+        <w:t>linkedList</w:t>
+      </w:r>
+      <w:r>
+        <w:rPr>
+          <w:rFonts w:ascii="Consolas" w:eastAsia="Times New Roman" w:hAnsi="Consolas" w:cs="Times New Roman"/>
+          <w:color w:val="CCCCCC"/>
+          <w:sz w:val="16"/>
+          <w:szCs w:val="16"/>
+          <w:lang w:val="en-US" w:eastAsia="ru-RU"/>
+        </w:rPr>
+        <w:t>.</w:t>
+      </w:r>
+      <w:r>
+        <w:rPr>
+          <w:rFonts w:ascii="Consolas" w:eastAsia="Times New Roman" w:hAnsi="Consolas" w:cs="Times New Roman"/>
+          <w:color w:val="DCDCAA"/>
+          <w:sz w:val="16"/>
+          <w:szCs w:val="16"/>
+          <w:lang w:val="en-US" w:eastAsia="ru-RU"/>
+        </w:rPr>
+        <w:t>clear</w:t>
+      </w:r>
+      <w:proofErr w:type="spellEnd"/>
+      <w:r>
+        <w:rPr>
+          <w:rFonts w:ascii="Consolas" w:eastAsia="Times New Roman" w:hAnsi="Consolas" w:cs="Times New Roman"/>
+          <w:color w:val="CCCCCC"/>
+          <w:sz w:val="16"/>
+          <w:szCs w:val="16"/>
+          <w:lang w:val="en-US" w:eastAsia="ru-RU"/>
+        </w:rPr>
+        <w:t>();</w:t>
+      </w:r>
+    </w:p>
+    <w:p>
+      <w:pPr>
+        <w:shd w:val="clear" w:color="auto" w:fill="1F1F1F"/>
+        <w:spacing w:after="0" w:line="285" w:lineRule="atLeast"/>
+        <w:rPr>
+          <w:rFonts w:ascii="Consolas" w:eastAsia="Times New Roman" w:hAnsi="Consolas" w:cs="Times New Roman"/>
+          <w:color w:val="CCCCCC"/>
+          <w:sz w:val="16"/>
+          <w:szCs w:val="16"/>
+          <w:lang w:val="en-US" w:eastAsia="ru-RU"/>
+        </w:rPr>
+      </w:pPr>
+      <w:r>
+        <w:rPr>
+          <w:rFonts w:ascii="Consolas" w:eastAsia="Times New Roman" w:hAnsi="Consolas" w:cs="Times New Roman"/>
+          <w:color w:val="CCCCCC"/>
+          <w:sz w:val="16"/>
+          <w:szCs w:val="16"/>
+          <w:lang w:val="en-US" w:eastAsia="ru-RU"/>
+        </w:rPr>
+        <w:t xml:space="preserve">            </w:t>
+      </w:r>
+      <w:proofErr w:type="spellStart"/>
+      <w:r>
+        <w:rPr>
+          <w:rFonts w:ascii="Consolas" w:eastAsia="Times New Roman" w:hAnsi="Consolas" w:cs="Times New Roman"/>
+          <w:color w:val="4EC9B0"/>
+          <w:sz w:val="16"/>
+          <w:szCs w:val="16"/>
+          <w:lang w:val="en-US" w:eastAsia="ru-RU"/>
+        </w:rPr>
+        <w:t>System</w:t>
+      </w:r>
+      <w:r>
+        <w:rPr>
+          <w:rFonts w:ascii="Consolas" w:eastAsia="Times New Roman" w:hAnsi="Consolas" w:cs="Times New Roman"/>
+          <w:color w:val="CCCCCC"/>
+          <w:sz w:val="16"/>
+          <w:szCs w:val="16"/>
+          <w:lang w:val="en-US" w:eastAsia="ru-RU"/>
+        </w:rPr>
+        <w:t>.</w:t>
+      </w:r>
+      <w:r>
+        <w:rPr>
+          <w:rFonts w:ascii="Consolas" w:eastAsia="Times New Roman" w:hAnsi="Consolas" w:cs="Times New Roman"/>
+          <w:color w:val="4FC1FF"/>
+          <w:sz w:val="16"/>
+          <w:szCs w:val="16"/>
+          <w:lang w:val="en-US" w:eastAsia="ru-RU"/>
+        </w:rPr>
+        <w:t>out</w:t>
+      </w:r>
+      <w:r>
+        <w:rPr>
+          <w:rFonts w:ascii="Consolas" w:eastAsia="Times New Roman" w:hAnsi="Consolas" w:cs="Times New Roman"/>
+          <w:color w:val="CCCCCC"/>
+          <w:sz w:val="16"/>
+          <w:szCs w:val="16"/>
+          <w:lang w:val="en-US" w:eastAsia="ru-RU"/>
+        </w:rPr>
+        <w:t>.</w:t>
+      </w:r>
+      <w:r>
+        <w:rPr>
+          <w:rFonts w:ascii="Consolas" w:eastAsia="Times New Roman" w:hAnsi="Consolas" w:cs="Times New Roman"/>
+          <w:color w:val="DCDCAA"/>
+          <w:sz w:val="16"/>
+          <w:szCs w:val="16"/>
+          <w:lang w:val="en-US" w:eastAsia="ru-RU"/>
+        </w:rPr>
+        <w:t>println</w:t>
+      </w:r>
+      <w:proofErr w:type="spellEnd"/>
+      <w:r>
+        <w:rPr>
+          <w:rFonts w:ascii="Consolas" w:eastAsia="Times New Roman" w:hAnsi="Consolas" w:cs="Times New Roman"/>
+          <w:color w:val="CCCCCC"/>
+          <w:sz w:val="16"/>
+          <w:szCs w:val="16"/>
+          <w:lang w:val="en-US" w:eastAsia="ru-RU"/>
+        </w:rPr>
+        <w:t>(</w:t>
+      </w:r>
+      <w:r>
+        <w:rPr>
+          <w:rFonts w:ascii="Consolas" w:eastAsia="Times New Roman" w:hAnsi="Consolas" w:cs="Times New Roman"/>
+          <w:color w:val="CE9178"/>
+          <w:sz w:val="16"/>
+          <w:szCs w:val="16"/>
+          <w:lang w:val="en-US" w:eastAsia="ru-RU"/>
+        </w:rPr>
+        <w:t>"n = "</w:t>
+      </w:r>
+      <w:r>
+        <w:rPr>
+          <w:rFonts w:ascii="Consolas" w:eastAsia="Times New Roman" w:hAnsi="Consolas" w:cs="Times New Roman"/>
+          <w:color w:val="CCCCCC"/>
+          <w:sz w:val="16"/>
+          <w:szCs w:val="16"/>
+          <w:lang w:val="en-US" w:eastAsia="ru-RU"/>
+        </w:rPr>
+        <w:t xml:space="preserve"> </w:t>
+      </w:r>
+      <w:r>
+        <w:rPr>
+          <w:rFonts w:ascii="Consolas" w:eastAsia="Times New Roman" w:hAnsi="Consolas" w:cs="Times New Roman"/>
+          <w:color w:val="D4D4D4"/>
+          <w:sz w:val="16"/>
+          <w:szCs w:val="16"/>
+          <w:lang w:val="en-US" w:eastAsia="ru-RU"/>
+        </w:rPr>
+        <w:t>+</w:t>
+      </w:r>
+      <w:r>
+        <w:rPr>
+          <w:rFonts w:ascii="Consolas" w:eastAsia="Times New Roman" w:hAnsi="Consolas" w:cs="Times New Roman"/>
+          <w:color w:val="CCCCCC"/>
+          <w:sz w:val="16"/>
+          <w:szCs w:val="16"/>
+          <w:lang w:val="en-US" w:eastAsia="ru-RU"/>
+        </w:rPr>
+        <w:t xml:space="preserve"> </w:t>
+      </w:r>
+      <w:r>
+        <w:rPr>
+          <w:rFonts w:ascii="Consolas" w:eastAsia="Times New Roman" w:hAnsi="Consolas" w:cs="Times New Roman"/>
+          <w:color w:val="9CDCFE"/>
+          <w:sz w:val="16"/>
+          <w:szCs w:val="16"/>
+          <w:lang w:val="en-US" w:eastAsia="ru-RU"/>
+        </w:rPr>
+        <w:t>size</w:t>
+      </w:r>
+      <w:r>
+        <w:rPr>
+          <w:rFonts w:ascii="Consolas" w:eastAsia="Times New Roman" w:hAnsi="Consolas" w:cs="Times New Roman"/>
+          <w:color w:val="CCCCCC"/>
+          <w:sz w:val="16"/>
+          <w:szCs w:val="16"/>
+          <w:lang w:val="en-US" w:eastAsia="ru-RU"/>
+        </w:rPr>
+        <w:t>);</w:t>
+      </w:r>
+    </w:p>
+    <w:p>
+      <w:pPr>
+        <w:shd w:val="clear" w:color="auto" w:fill="1F1F1F"/>
+        <w:spacing w:after="0" w:line="285" w:lineRule="atLeast"/>
+        <w:rPr>
+          <w:rFonts w:ascii="Consolas" w:eastAsia="Times New Roman" w:hAnsi="Consolas" w:cs="Times New Roman"/>
+          <w:color w:val="CCCCCC"/>
+          <w:sz w:val="16"/>
+          <w:szCs w:val="16"/>
+          <w:lang w:val="en-US" w:eastAsia="ru-RU"/>
+        </w:rPr>
+      </w:pPr>
+    </w:p>
+    <w:p>
+      <w:pPr>
+        <w:shd w:val="clear" w:color="auto" w:fill="1F1F1F"/>
+        <w:spacing w:after="0" w:line="285" w:lineRule="atLeast"/>
+        <w:rPr>
+          <w:rFonts w:ascii="Consolas" w:eastAsia="Times New Roman" w:hAnsi="Consolas" w:cs="Times New Roman"/>
+          <w:color w:val="CCCCCC"/>
+          <w:sz w:val="16"/>
+          <w:szCs w:val="16"/>
+          <w:lang w:val="en-US" w:eastAsia="ru-RU"/>
+        </w:rPr>
+      </w:pPr>
+      <w:r>
+        <w:rPr>
+          <w:rFonts w:ascii="Consolas" w:eastAsia="Times New Roman" w:hAnsi="Consolas" w:cs="Times New Roman"/>
+          <w:color w:val="CCCCCC"/>
+          <w:sz w:val="16"/>
+          <w:szCs w:val="16"/>
+          <w:lang w:val="en-US" w:eastAsia="ru-RU"/>
+        </w:rPr>
+        <w:t xml:space="preserve">            </w:t>
+      </w:r>
+      <w:r>
+        <w:rPr>
+          <w:rFonts w:ascii="Consolas" w:eastAsia="Times New Roman" w:hAnsi="Consolas" w:cs="Times New Roman"/>
+          <w:color w:val="6A9955"/>
+          <w:sz w:val="16"/>
+          <w:szCs w:val="16"/>
+          <w:lang w:val="en-US" w:eastAsia="ru-RU"/>
+        </w:rPr>
+        <w:t xml:space="preserve">// </w:t>
+      </w:r>
+      <w:r>
+        <w:rPr>
+          <w:rFonts w:ascii="Consolas" w:eastAsia="Times New Roman" w:hAnsi="Consolas" w:cs="Times New Roman"/>
+          <w:color w:val="6A9955"/>
+          <w:sz w:val="16"/>
+          <w:szCs w:val="16"/>
+          <w:lang w:eastAsia="ru-RU"/>
+        </w:rPr>
+        <w:t>Добавление</w:t>
+      </w:r>
+      <w:r>
+        <w:rPr>
+          <w:rFonts w:ascii="Consolas" w:eastAsia="Times New Roman" w:hAnsi="Consolas" w:cs="Times New Roman"/>
+          <w:color w:val="6A9955"/>
+          <w:sz w:val="16"/>
+          <w:szCs w:val="16"/>
+          <w:lang w:val="en-US" w:eastAsia="ru-RU"/>
+        </w:rPr>
+        <w:t xml:space="preserve"> </w:t>
+      </w:r>
+      <w:r>
+        <w:rPr>
+          <w:rFonts w:ascii="Consolas" w:eastAsia="Times New Roman" w:hAnsi="Consolas" w:cs="Times New Roman"/>
+          <w:color w:val="6A9955"/>
+          <w:sz w:val="16"/>
+          <w:szCs w:val="16"/>
+          <w:lang w:eastAsia="ru-RU"/>
+        </w:rPr>
+        <w:t>в</w:t>
+      </w:r>
+      <w:r>
+        <w:rPr>
+          <w:rFonts w:ascii="Consolas" w:eastAsia="Times New Roman" w:hAnsi="Consolas" w:cs="Times New Roman"/>
+          <w:color w:val="6A9955"/>
+          <w:sz w:val="16"/>
+          <w:szCs w:val="16"/>
+          <w:lang w:val="en-US" w:eastAsia="ru-RU"/>
+        </w:rPr>
+        <w:t xml:space="preserve"> HashSet</w:t>
+      </w:r>
+    </w:p>
+    <w:p>
+      <w:pPr>
+        <w:shd w:val="clear" w:color="auto" w:fill="1F1F1F"/>
+        <w:spacing w:after="0" w:line="285" w:lineRule="atLeast"/>
+        <w:rPr>
+          <w:rFonts w:ascii="Consolas" w:eastAsia="Times New Roman" w:hAnsi="Consolas" w:cs="Times New Roman"/>
+          <w:color w:val="CCCCCC"/>
+          <w:sz w:val="16"/>
+          <w:szCs w:val="16"/>
+          <w:lang w:val="en-US" w:eastAsia="ru-RU"/>
+        </w:rPr>
+      </w:pPr>
+      <w:r>
+        <w:rPr>
+          <w:rFonts w:ascii="Consolas" w:eastAsia="Times New Roman" w:hAnsi="Consolas" w:cs="Times New Roman"/>
+          <w:color w:val="CCCCCC"/>
+          <w:sz w:val="16"/>
+          <w:szCs w:val="16"/>
+          <w:lang w:val="en-US" w:eastAsia="ru-RU"/>
+        </w:rPr>
+        <w:t xml:space="preserve">            </w:t>
+      </w:r>
+      <w:proofErr w:type="spellStart"/>
+      <w:r>
+        <w:rPr>
+          <w:rFonts w:ascii="Consolas" w:eastAsia="Times New Roman" w:hAnsi="Consolas" w:cs="Times New Roman"/>
           <w:color w:val="4EC9B0"/>
           <w:sz w:val="16"/>
           <w:szCs w:val="16"/>
@@ -16976,6 +16843,7 @@
           <w:szCs w:val="16"/>
           <w:lang w:val="en-US" w:eastAsia="ru-RU"/>
         </w:rPr>
+        <w:lastRenderedPageBreak/>
         <w:t xml:space="preserve">            </w:t>
       </w:r>
       <w:r>
@@ -17525,7 +17393,6 @@
           <w:szCs w:val="16"/>
           <w:lang w:val="en-US" w:eastAsia="ru-RU"/>
         </w:rPr>
-        <w:lastRenderedPageBreak/>
         <w:t xml:space="preserve">// </w:t>
       </w:r>
       <w:r>
@@ -21525,6 +21392,7 @@
           <w:szCs w:val="16"/>
           <w:lang w:val="en-US" w:eastAsia="ru-RU"/>
         </w:rPr>
+        <w:lastRenderedPageBreak/>
         <w:t xml:space="preserve">            </w:t>
       </w:r>
       <w:proofErr w:type="spellStart"/>
@@ -21668,7 +21536,7 @@
           <w:color w:val="CCCCCC"/>
           <w:sz w:val="16"/>
           <w:szCs w:val="16"/>
-          <w:lang w:eastAsia="ru-RU"/>
+          <w:lang w:val="en-US" w:eastAsia="ru-RU"/>
         </w:rPr>
       </w:pPr>
       <w:r>
@@ -21689,7 +21557,7 @@
           <w:color w:val="9CDCFE"/>
           <w:sz w:val="16"/>
           <w:szCs w:val="16"/>
-          <w:lang w:eastAsia="ru-RU"/>
+          <w:lang w:val="en-US" w:eastAsia="ru-RU"/>
         </w:rPr>
         <w:t>frame</w:t>
       </w:r>
@@ -21699,7 +21567,7 @@
           <w:color w:val="CCCCCC"/>
           <w:sz w:val="16"/>
           <w:szCs w:val="16"/>
-          <w:lang w:eastAsia="ru-RU"/>
+          <w:lang w:val="en-US" w:eastAsia="ru-RU"/>
         </w:rPr>
         <w:t>.</w:t>
       </w:r>
@@ -21709,7 +21577,7 @@
           <w:color w:val="DCDCAA"/>
           <w:sz w:val="16"/>
           <w:szCs w:val="16"/>
-          <w:lang w:eastAsia="ru-RU"/>
+          <w:lang w:val="en-US" w:eastAsia="ru-RU"/>
         </w:rPr>
         <w:t>setVisible</w:t>
       </w:r>
@@ -21721,29 +21589,27 @@
           <w:color w:val="CCCCCC"/>
           <w:sz w:val="16"/>
           <w:szCs w:val="16"/>
-          <w:lang w:eastAsia="ru-RU"/>
+          <w:lang w:val="en-US" w:eastAsia="ru-RU"/>
         </w:rPr>
         <w:t>(</w:t>
       </w:r>
-      <w:proofErr w:type="spellStart"/>
       <w:r>
         <w:rPr>
           <w:rFonts w:ascii="Consolas" w:eastAsia="Times New Roman" w:hAnsi="Consolas" w:cs="Times New Roman"/>
           <w:color w:val="569CD6"/>
           <w:sz w:val="16"/>
           <w:szCs w:val="16"/>
-          <w:lang w:eastAsia="ru-RU"/>
+          <w:lang w:val="en-US" w:eastAsia="ru-RU"/>
         </w:rPr>
         <w:t>true</w:t>
       </w:r>
-      <w:proofErr w:type="spellEnd"/>
-      <w:r>
-        <w:rPr>
-          <w:rFonts w:ascii="Consolas" w:eastAsia="Times New Roman" w:hAnsi="Consolas" w:cs="Times New Roman"/>
-          <w:color w:val="CCCCCC"/>
-          <w:sz w:val="16"/>
-          <w:szCs w:val="16"/>
-          <w:lang w:eastAsia="ru-RU"/>
+      <w:r>
+        <w:rPr>
+          <w:rFonts w:ascii="Consolas" w:eastAsia="Times New Roman" w:hAnsi="Consolas" w:cs="Times New Roman"/>
+          <w:color w:val="CCCCCC"/>
+          <w:sz w:val="16"/>
+          <w:szCs w:val="16"/>
+          <w:lang w:val="en-US" w:eastAsia="ru-RU"/>
         </w:rPr>
         <w:t>);</w:t>
       </w:r>
@@ -21766,9 +21632,19 @@
           <w:color w:val="CCCCCC"/>
           <w:sz w:val="16"/>
           <w:szCs w:val="16"/>
+          <w:lang w:val="en-US" w:eastAsia="ru-RU"/>
+        </w:rPr>
+        <w:t xml:space="preserve">        </w:t>
+      </w:r>
+      <w:r>
+        <w:rPr>
+          <w:rFonts w:ascii="Consolas" w:eastAsia="Times New Roman" w:hAnsi="Consolas" w:cs="Times New Roman"/>
+          <w:color w:val="CCCCCC"/>
+          <w:sz w:val="16"/>
+          <w:szCs w:val="16"/>
           <w:lang w:eastAsia="ru-RU"/>
         </w:rPr>
-        <w:t>        });</w:t>
+        <w:t>});</w:t>
       </w:r>
     </w:p>
     <w:p>
@@ -24148,8 +24024,8 @@
         <w:tblLook w:val="04A0" w:firstRow="1" w:lastRow="0" w:firstColumn="1" w:lastColumn="0" w:noHBand="0" w:noVBand="1"/>
       </w:tblPr>
       <w:tblGrid>
-        <w:gridCol w:w="4800"/>
-        <w:gridCol w:w="4771"/>
+        <w:gridCol w:w="4885"/>
+        <w:gridCol w:w="4686"/>
       </w:tblGrid>
       <w:tr>
         <w:tc>
@@ -24178,10 +24054,10 @@
                 <w:szCs w:val="32"/>
               </w:rPr>
               <w:drawing>
-                <wp:inline distT="0" distB="0" distL="0" distR="0" wp14:anchorId="7B50AE32" wp14:editId="594A2809">
-                  <wp:extent cx="2943225" cy="1929228"/>
-                  <wp:effectExtent l="0" t="0" r="0" b="0"/>
-                  <wp:docPr id="1397184315" name="Рисунок 15"/>
+                <wp:inline distT="0" distB="0" distL="0" distR="0" wp14:anchorId="755F740E" wp14:editId="19329D6B">
+                  <wp:extent cx="2780935" cy="2571750"/>
+                  <wp:effectExtent l="0" t="0" r="635" b="0"/>
+                  <wp:docPr id="2069361230" name="Рисунок 3"/>
                   <wp:cNvGraphicFramePr>
                     <a:graphicFrameLocks xmlns:a="http://schemas.openxmlformats.org/drawingml/2006/main" noChangeAspect="1"/>
                   </wp:cNvGraphicFramePr>
@@ -24189,7 +24065,7 @@
                     <a:graphicData uri="http://schemas.openxmlformats.org/drawingml/2006/picture">
                       <pic:pic xmlns:pic="http://schemas.openxmlformats.org/drawingml/2006/picture">
                         <pic:nvPicPr>
-                          <pic:cNvPr id="0" name="Picture 34"/>
+                          <pic:cNvPr id="0" name="Picture 3"/>
                           <pic:cNvPicPr>
                             <a:picLocks noChangeAspect="1" noChangeArrowheads="1"/>
                           </pic:cNvPicPr>
@@ -24210,7 +24086,7 @@
                         <pic:spPr bwMode="auto">
                           <a:xfrm>
                             <a:off x="0" y="0"/>
-                            <a:ext cx="2957942" cy="1938874"/>
+                            <a:ext cx="2787553" cy="2577870"/>
                           </a:xfrm>
                           <a:prstGeom prst="rect">
                             <a:avLst/>
@@ -24254,10 +24130,10 @@
                 <w:szCs w:val="32"/>
               </w:rPr>
               <w:drawing>
-                <wp:inline distT="0" distB="0" distL="0" distR="0" wp14:anchorId="4E04B62B" wp14:editId="239EF6DB">
-                  <wp:extent cx="2924175" cy="1915605"/>
-                  <wp:effectExtent l="0" t="0" r="0" b="8890"/>
-                  <wp:docPr id="1185085493" name="Рисунок 16"/>
+                <wp:inline distT="0" distB="0" distL="0" distR="0" wp14:anchorId="6AA90E98" wp14:editId="217B269B">
+                  <wp:extent cx="2728008" cy="2571750"/>
+                  <wp:effectExtent l="0" t="0" r="0" b="0"/>
+                  <wp:docPr id="1357723453" name="Рисунок 5"/>
                   <wp:cNvGraphicFramePr>
                     <a:graphicFrameLocks xmlns:a="http://schemas.openxmlformats.org/drawingml/2006/main" noChangeAspect="1"/>
                   </wp:cNvGraphicFramePr>
@@ -24265,7 +24141,7 @@
                     <a:graphicData uri="http://schemas.openxmlformats.org/drawingml/2006/picture">
                       <pic:pic xmlns:pic="http://schemas.openxmlformats.org/drawingml/2006/picture">
                         <pic:nvPicPr>
-                          <pic:cNvPr id="0" name="Picture 35"/>
+                          <pic:cNvPr id="0" name="Picture 5"/>
                           <pic:cNvPicPr>
                             <a:picLocks noChangeAspect="1" noChangeArrowheads="1"/>
                           </pic:cNvPicPr>
@@ -24286,7 +24162,7 @@
                         <pic:spPr bwMode="auto">
                           <a:xfrm>
                             <a:off x="0" y="0"/>
-                            <a:ext cx="2934419" cy="1922316"/>
+                            <a:ext cx="2735123" cy="2578458"/>
                           </a:xfrm>
                           <a:prstGeom prst="rect">
                             <a:avLst/>
@@ -24316,6 +24192,7 @@
           <w:p>
             <w:pPr>
               <w:spacing w:line="240" w:lineRule="auto"/>
+              <w:jc w:val="center"/>
               <w:rPr>
                 <w:rFonts w:ascii="Times New Roman" w:hAnsi="Times New Roman" w:cs="Times New Roman"/>
                 <w:b/>
@@ -24334,10 +24211,10 @@
                 <w:szCs w:val="32"/>
               </w:rPr>
               <w:drawing>
-                <wp:inline distT="0" distB="0" distL="0" distR="0" wp14:anchorId="6DF21963" wp14:editId="660BEF87">
-                  <wp:extent cx="2905023" cy="2061713"/>
+                <wp:inline distT="0" distB="0" distL="0" distR="0" wp14:anchorId="3C57ED09" wp14:editId="40EF3F00">
+                  <wp:extent cx="2914672" cy="2733675"/>
                   <wp:effectExtent l="0" t="0" r="0" b="0"/>
-                  <wp:docPr id="529408704" name="Рисунок 14"/>
+                  <wp:docPr id="376583277" name="Рисунок 2"/>
                   <wp:cNvGraphicFramePr>
                     <a:graphicFrameLocks xmlns:a="http://schemas.openxmlformats.org/drawingml/2006/main" noChangeAspect="1"/>
                   </wp:cNvGraphicFramePr>
@@ -24345,7 +24222,7 @@
                     <a:graphicData uri="http://schemas.openxmlformats.org/drawingml/2006/picture">
                       <pic:pic xmlns:pic="http://schemas.openxmlformats.org/drawingml/2006/picture">
                         <pic:nvPicPr>
-                          <pic:cNvPr id="0" name="Picture 33"/>
+                          <pic:cNvPr id="0" name="Picture 2"/>
                           <pic:cNvPicPr>
                             <a:picLocks noChangeAspect="1" noChangeArrowheads="1"/>
                           </pic:cNvPicPr>
@@ -24366,7 +24243,7 @@
                         <pic:spPr bwMode="auto">
                           <a:xfrm>
                             <a:off x="0" y="0"/>
-                            <a:ext cx="2941880" cy="2087870"/>
+                            <a:ext cx="2922290" cy="2740820"/>
                           </a:xfrm>
                           <a:prstGeom prst="rect">
                             <a:avLst/>
@@ -24410,10 +24287,10 @@
                 <w:szCs w:val="32"/>
               </w:rPr>
               <w:drawing>
-                <wp:inline distT="0" distB="0" distL="0" distR="0" wp14:anchorId="4BB00DCD" wp14:editId="72F0F810">
-                  <wp:extent cx="2923496" cy="2050866"/>
-                  <wp:effectExtent l="0" t="0" r="0" b="6985"/>
-                  <wp:docPr id="199532439" name="Рисунок 13"/>
+                <wp:inline distT="0" distB="0" distL="0" distR="0" wp14:anchorId="0FBCD373" wp14:editId="2FD9CD96">
+                  <wp:extent cx="2835692" cy="2695575"/>
+                  <wp:effectExtent l="0" t="0" r="3175" b="0"/>
+                  <wp:docPr id="1961327376" name="Рисунок 4"/>
                   <wp:cNvGraphicFramePr>
                     <a:graphicFrameLocks xmlns:a="http://schemas.openxmlformats.org/drawingml/2006/main" noChangeAspect="1"/>
                   </wp:cNvGraphicFramePr>
@@ -24421,7 +24298,7 @@
                     <a:graphicData uri="http://schemas.openxmlformats.org/drawingml/2006/picture">
                       <pic:pic xmlns:pic="http://schemas.openxmlformats.org/drawingml/2006/picture">
                         <pic:nvPicPr>
-                          <pic:cNvPr id="0" name="Picture 32"/>
+                          <pic:cNvPr id="0" name="Picture 4"/>
                           <pic:cNvPicPr>
                             <a:picLocks noChangeAspect="1" noChangeArrowheads="1"/>
                           </pic:cNvPicPr>
@@ -24442,7 +24319,7 @@
                         <pic:spPr bwMode="auto">
                           <a:xfrm>
                             <a:off x="0" y="0"/>
-                            <a:ext cx="2970302" cy="2083701"/>
+                            <a:ext cx="2848443" cy="2707696"/>
                           </a:xfrm>
                           <a:prstGeom prst="rect">
                             <a:avLst/>
@@ -24502,7 +24379,25 @@
                 <w:sz w:val="28"/>
                 <w:szCs w:val="28"/>
               </w:rPr>
-              <w:t>Графики зависимости времени добавления и поиска элементов в заданных контейнерах от числа элементов в контейнерах</w:t>
+              <w:t>Графики зависимости времени добавления и поиска элементов в контейнерах от числа элементов</w:t>
+            </w:r>
+            <w:r>
+              <w:rPr>
+                <w:rFonts w:ascii="Times New Roman" w:hAnsi="Times New Roman" w:cs="Times New Roman"/>
+                <w:sz w:val="28"/>
+                <w:szCs w:val="28"/>
+              </w:rPr>
+              <w:t xml:space="preserve">: </w:t>
+            </w:r>
+            <w:r>
+              <w:rPr>
+                <w:rFonts w:ascii="Times New Roman" w:hAnsi="Times New Roman" w:cs="Times New Roman"/>
+                <w:b/>
+                <w:bCs/>
+                <w:sz w:val="28"/>
+                <w:szCs w:val="28"/>
+              </w:rPr>
+              <w:t>10 000-100 000</w:t>
             </w:r>
           </w:p>
         </w:tc>
@@ -24587,55 +24482,11 @@
     <w:p>
       <w:pPr>
         <w:spacing w:line="240" w:lineRule="auto"/>
-        <w:jc w:val="center"/>
-        <w:rPr>
-          <w:rFonts w:ascii="Times New Roman" w:hAnsi="Times New Roman" w:cs="Times New Roman"/>
-          <w:sz w:val="28"/>
-          <w:szCs w:val="28"/>
-        </w:rPr>
-      </w:pPr>
-    </w:p>
-    <w:p>
-      <w:pPr>
-        <w:spacing w:line="240" w:lineRule="auto"/>
-        <w:jc w:val="center"/>
-        <w:rPr>
-          <w:rFonts w:ascii="Times New Roman" w:hAnsi="Times New Roman" w:cs="Times New Roman"/>
-          <w:sz w:val="28"/>
-          <w:szCs w:val="28"/>
-        </w:rPr>
-      </w:pPr>
-    </w:p>
-    <w:p>
-      <w:pPr>
-        <w:spacing w:line="240" w:lineRule="auto"/>
-        <w:jc w:val="center"/>
-        <w:rPr>
-          <w:rFonts w:ascii="Times New Roman" w:hAnsi="Times New Roman" w:cs="Times New Roman"/>
-          <w:sz w:val="28"/>
-          <w:szCs w:val="28"/>
-        </w:rPr>
-      </w:pPr>
-    </w:p>
-    <w:p>
-      <w:pPr>
-        <w:spacing w:line="240" w:lineRule="auto"/>
-        <w:jc w:val="center"/>
-        <w:rPr>
-          <w:rFonts w:ascii="Times New Roman" w:hAnsi="Times New Roman" w:cs="Times New Roman"/>
-          <w:sz w:val="28"/>
-          <w:szCs w:val="28"/>
-        </w:rPr>
-      </w:pPr>
-    </w:p>
-    <w:p>
-      <w:pPr>
-        <w:spacing w:line="240" w:lineRule="auto"/>
-        <w:jc w:val="center"/>
-        <w:rPr>
-          <w:rFonts w:ascii="Times New Roman" w:hAnsi="Times New Roman" w:cs="Times New Roman"/>
-          <w:sz w:val="28"/>
-          <w:szCs w:val="28"/>
+        <w:rPr>
+          <w:rFonts w:ascii="Times New Roman" w:hAnsi="Times New Roman" w:cs="Times New Roman"/>
+          <w:sz w:val="28"/>
+          <w:szCs w:val="28"/>
+          <w:lang w:val="en-US"/>
         </w:rPr>
       </w:pPr>
     </w:p>
@@ -24654,8 +24505,8 @@
         <w:tblLook w:val="04A0" w:firstRow="1" w:lastRow="0" w:firstColumn="1" w:lastColumn="0" w:noHBand="0" w:noVBand="1"/>
       </w:tblPr>
       <w:tblGrid>
-        <w:gridCol w:w="4662"/>
-        <w:gridCol w:w="4909"/>
+        <w:gridCol w:w="5155"/>
+        <w:gridCol w:w="4416"/>
       </w:tblGrid>
       <w:tr>
         <w:tc>
@@ -24685,10 +24536,10 @@
               </w:rPr>
               <w:lastRenderedPageBreak/>
               <w:drawing>
-                <wp:inline distT="0" distB="0" distL="0" distR="0" wp14:anchorId="240E223F" wp14:editId="6A5F3844">
-                  <wp:extent cx="2924175" cy="1504046"/>
-                  <wp:effectExtent l="0" t="0" r="0" b="1270"/>
-                  <wp:docPr id="2072868798" name="Рисунок 21"/>
+                <wp:inline distT="0" distB="0" distL="0" distR="0" wp14:anchorId="6B86FECF" wp14:editId="6350AADA">
+                  <wp:extent cx="2802068" cy="2447925"/>
+                  <wp:effectExtent l="0" t="0" r="0" b="0"/>
+                  <wp:docPr id="876286902" name="Рисунок 7"/>
                   <wp:cNvGraphicFramePr>
                     <a:graphicFrameLocks xmlns:a="http://schemas.openxmlformats.org/drawingml/2006/main" noChangeAspect="1"/>
                   </wp:cNvGraphicFramePr>
@@ -24696,7 +24547,7 @@
                     <a:graphicData uri="http://schemas.openxmlformats.org/drawingml/2006/picture">
                       <pic:pic xmlns:pic="http://schemas.openxmlformats.org/drawingml/2006/picture">
                         <pic:nvPicPr>
-                          <pic:cNvPr id="0" name="Picture 40"/>
+                          <pic:cNvPr id="0" name="Picture 7"/>
                           <pic:cNvPicPr>
                             <a:picLocks noChangeAspect="1" noChangeArrowheads="1"/>
                           </pic:cNvPicPr>
@@ -24717,7 +24568,7 @@
                         <pic:spPr bwMode="auto">
                           <a:xfrm>
                             <a:off x="0" y="0"/>
-                            <a:ext cx="2932553" cy="1508355"/>
+                            <a:ext cx="2813812" cy="2458185"/>
                           </a:xfrm>
                           <a:prstGeom prst="rect">
                             <a:avLst/>
@@ -24761,10 +24612,10 @@
                 <w:szCs w:val="28"/>
               </w:rPr>
               <w:drawing>
-                <wp:inline distT="0" distB="0" distL="0" distR="0" wp14:anchorId="479E8F54" wp14:editId="4BE1C4BB">
-                  <wp:extent cx="2771140" cy="1486230"/>
+                <wp:inline distT="0" distB="0" distL="0" distR="0" wp14:anchorId="0E877DD5" wp14:editId="103C59BC">
+                  <wp:extent cx="2667611" cy="2447925"/>
                   <wp:effectExtent l="0" t="0" r="0" b="0"/>
-                  <wp:docPr id="352737692" name="Рисунок 20"/>
+                  <wp:docPr id="1369752793" name="Рисунок 9"/>
                   <wp:cNvGraphicFramePr>
                     <a:graphicFrameLocks xmlns:a="http://schemas.openxmlformats.org/drawingml/2006/main" noChangeAspect="1"/>
                   </wp:cNvGraphicFramePr>
@@ -24772,7 +24623,7 @@
                     <a:graphicData uri="http://schemas.openxmlformats.org/drawingml/2006/picture">
                       <pic:pic xmlns:pic="http://schemas.openxmlformats.org/drawingml/2006/picture">
                         <pic:nvPicPr>
-                          <pic:cNvPr id="0" name="Picture 39"/>
+                          <pic:cNvPr id="0" name="Picture 9"/>
                           <pic:cNvPicPr>
                             <a:picLocks noChangeAspect="1" noChangeArrowheads="1"/>
                           </pic:cNvPicPr>
@@ -24793,7 +24644,7 @@
                         <pic:spPr bwMode="auto">
                           <a:xfrm>
                             <a:off x="0" y="0"/>
-                            <a:ext cx="2791800" cy="1497310"/>
+                            <a:ext cx="2671813" cy="2451781"/>
                           </a:xfrm>
                           <a:prstGeom prst="rect">
                             <a:avLst/>
@@ -24842,10 +24693,10 @@
                 <w:szCs w:val="28"/>
               </w:rPr>
               <w:drawing>
-                <wp:inline distT="0" distB="0" distL="0" distR="0" wp14:anchorId="61F99AB5" wp14:editId="3AFC0FAD">
-                  <wp:extent cx="2724150" cy="1789809"/>
-                  <wp:effectExtent l="0" t="0" r="0" b="1270"/>
-                  <wp:docPr id="247362889" name="Рисунок 17"/>
+                <wp:inline distT="0" distB="0" distL="0" distR="0" wp14:anchorId="38F23C80" wp14:editId="5C815E26">
+                  <wp:extent cx="2873286" cy="2609850"/>
+                  <wp:effectExtent l="0" t="0" r="3810" b="0"/>
+                  <wp:docPr id="1166623235" name="Рисунок 6"/>
                   <wp:cNvGraphicFramePr>
                     <a:graphicFrameLocks xmlns:a="http://schemas.openxmlformats.org/drawingml/2006/main" noChangeAspect="1"/>
                   </wp:cNvGraphicFramePr>
@@ -24853,7 +24704,7 @@
                     <a:graphicData uri="http://schemas.openxmlformats.org/drawingml/2006/picture">
                       <pic:pic xmlns:pic="http://schemas.openxmlformats.org/drawingml/2006/picture">
                         <pic:nvPicPr>
-                          <pic:cNvPr id="0" name="Picture 36"/>
+                          <pic:cNvPr id="0" name="Picture 6"/>
                           <pic:cNvPicPr>
                             <a:picLocks noChangeAspect="1" noChangeArrowheads="1"/>
                           </pic:cNvPicPr>
@@ -24874,7 +24725,7 @@
                         <pic:spPr bwMode="auto">
                           <a:xfrm>
                             <a:off x="0" y="0"/>
-                            <a:ext cx="2738967" cy="1799544"/>
+                            <a:ext cx="2880466" cy="2616372"/>
                           </a:xfrm>
                           <a:prstGeom prst="rect">
                             <a:avLst/>
@@ -24918,10 +24769,10 @@
                 <w:szCs w:val="28"/>
               </w:rPr>
               <w:drawing>
-                <wp:inline distT="0" distB="0" distL="0" distR="0" wp14:anchorId="04690009" wp14:editId="5041F712">
-                  <wp:extent cx="3086100" cy="1882667"/>
-                  <wp:effectExtent l="0" t="0" r="0" b="3810"/>
-                  <wp:docPr id="189193484" name="Рисунок 18"/>
+                <wp:inline distT="0" distB="0" distL="0" distR="0" wp14:anchorId="6C0D4D79" wp14:editId="638E89C2">
+                  <wp:extent cx="2605970" cy="2667000"/>
+                  <wp:effectExtent l="0" t="0" r="4445" b="0"/>
+                  <wp:docPr id="1684130406" name="Рисунок 8"/>
                   <wp:cNvGraphicFramePr>
                     <a:graphicFrameLocks xmlns:a="http://schemas.openxmlformats.org/drawingml/2006/main" noChangeAspect="1"/>
                   </wp:cNvGraphicFramePr>
@@ -24929,7 +24780,7 @@
                     <a:graphicData uri="http://schemas.openxmlformats.org/drawingml/2006/picture">
                       <pic:pic xmlns:pic="http://schemas.openxmlformats.org/drawingml/2006/picture">
                         <pic:nvPicPr>
-                          <pic:cNvPr id="0" name="Picture 37"/>
+                          <pic:cNvPr id="0" name="Picture 8"/>
                           <pic:cNvPicPr>
                             <a:picLocks noChangeAspect="1" noChangeArrowheads="1"/>
                           </pic:cNvPicPr>
@@ -24950,7 +24801,7 @@
                         <pic:spPr bwMode="auto">
                           <a:xfrm>
                             <a:off x="0" y="0"/>
-                            <a:ext cx="3114211" cy="1899816"/>
+                            <a:ext cx="2612792" cy="2673982"/>
                           </a:xfrm>
                           <a:prstGeom prst="rect">
                             <a:avLst/>
@@ -25026,533 +24877,7 @@
                 <w:sz w:val="28"/>
                 <w:szCs w:val="28"/>
               </w:rPr>
-              <w:t>: Графики зависимости времени добавления и поиска элементов в заданных контейнерах от числа элементов в контейнерах</w:t>
-            </w:r>
-          </w:p>
-        </w:tc>
-      </w:tr>
-    </w:tbl>
-    <w:p>
-      <w:pPr>
-        <w:spacing w:line="240" w:lineRule="auto"/>
-        <w:jc w:val="center"/>
-        <w:rPr>
-          <w:rFonts w:ascii="Times New Roman" w:hAnsi="Times New Roman" w:cs="Times New Roman"/>
-          <w:sz w:val="28"/>
-          <w:szCs w:val="28"/>
-        </w:rPr>
-      </w:pPr>
-    </w:p>
-    <w:p>
-      <w:pPr>
-        <w:spacing w:line="240" w:lineRule="auto"/>
-        <w:jc w:val="both"/>
-        <w:rPr>
-          <w:rFonts w:ascii="Times New Roman" w:hAnsi="Times New Roman" w:cs="Times New Roman"/>
-          <w:sz w:val="20"/>
-          <w:szCs w:val="20"/>
-        </w:rPr>
-      </w:pPr>
-    </w:p>
-    <w:p>
-      <w:pPr>
-        <w:spacing w:line="240" w:lineRule="auto"/>
-        <w:jc w:val="both"/>
-        <w:rPr>
-          <w:rFonts w:ascii="Times New Roman" w:hAnsi="Times New Roman" w:cs="Times New Roman"/>
-          <w:sz w:val="32"/>
-          <w:szCs w:val="32"/>
-        </w:rPr>
-      </w:pPr>
-    </w:p>
-    <w:p>
-      <w:pPr>
-        <w:spacing w:line="240" w:lineRule="auto"/>
-        <w:jc w:val="both"/>
-        <w:rPr>
-          <w:rFonts w:ascii="Times New Roman" w:hAnsi="Times New Roman" w:cs="Times New Roman"/>
-          <w:sz w:val="32"/>
-          <w:szCs w:val="32"/>
-        </w:rPr>
-      </w:pPr>
-    </w:p>
-    <w:p>
-      <w:pPr>
-        <w:spacing w:line="240" w:lineRule="auto"/>
-        <w:jc w:val="both"/>
-        <w:rPr>
-          <w:rFonts w:ascii="Times New Roman" w:hAnsi="Times New Roman" w:cs="Times New Roman"/>
-          <w:sz w:val="32"/>
-          <w:szCs w:val="32"/>
-        </w:rPr>
-      </w:pPr>
-    </w:p>
-    <w:p>
-      <w:pPr>
-        <w:spacing w:line="240" w:lineRule="auto"/>
-        <w:jc w:val="both"/>
-        <w:rPr>
-          <w:rFonts w:ascii="Times New Roman" w:hAnsi="Times New Roman" w:cs="Times New Roman"/>
-          <w:sz w:val="32"/>
-          <w:szCs w:val="32"/>
-        </w:rPr>
-      </w:pPr>
-    </w:p>
-    <w:p>
-      <w:pPr>
-        <w:spacing w:line="240" w:lineRule="auto"/>
-        <w:jc w:val="both"/>
-        <w:rPr>
-          <w:rFonts w:ascii="Times New Roman" w:hAnsi="Times New Roman" w:cs="Times New Roman"/>
-          <w:sz w:val="32"/>
-          <w:szCs w:val="32"/>
-        </w:rPr>
-      </w:pPr>
-    </w:p>
-    <w:p>
-      <w:pPr>
-        <w:spacing w:line="240" w:lineRule="auto"/>
-        <w:jc w:val="both"/>
-        <w:rPr>
-          <w:rFonts w:ascii="Times New Roman" w:hAnsi="Times New Roman" w:cs="Times New Roman"/>
-          <w:sz w:val="32"/>
-          <w:szCs w:val="32"/>
-        </w:rPr>
-      </w:pPr>
-    </w:p>
-    <w:p>
-      <w:pPr>
-        <w:spacing w:line="240" w:lineRule="auto"/>
-        <w:jc w:val="both"/>
-        <w:rPr>
-          <w:rFonts w:ascii="Times New Roman" w:hAnsi="Times New Roman" w:cs="Times New Roman"/>
-          <w:sz w:val="32"/>
-          <w:szCs w:val="32"/>
-        </w:rPr>
-      </w:pPr>
-    </w:p>
-    <w:p>
-      <w:pPr>
-        <w:spacing w:line="240" w:lineRule="auto"/>
-        <w:jc w:val="both"/>
-        <w:rPr>
-          <w:rFonts w:ascii="Times New Roman" w:hAnsi="Times New Roman" w:cs="Times New Roman"/>
-          <w:sz w:val="32"/>
-          <w:szCs w:val="32"/>
-        </w:rPr>
-      </w:pPr>
-    </w:p>
-    <w:p>
-      <w:pPr>
-        <w:spacing w:line="240" w:lineRule="auto"/>
-        <w:jc w:val="both"/>
-        <w:rPr>
-          <w:rFonts w:ascii="Times New Roman" w:hAnsi="Times New Roman" w:cs="Times New Roman"/>
-          <w:sz w:val="32"/>
-          <w:szCs w:val="32"/>
-        </w:rPr>
-      </w:pPr>
-    </w:p>
-    <w:p>
-      <w:pPr>
-        <w:spacing w:line="240" w:lineRule="auto"/>
-        <w:jc w:val="both"/>
-        <w:rPr>
-          <w:rFonts w:ascii="Times New Roman" w:hAnsi="Times New Roman" w:cs="Times New Roman"/>
-          <w:sz w:val="32"/>
-          <w:szCs w:val="32"/>
-        </w:rPr>
-      </w:pPr>
-    </w:p>
-    <w:p>
-      <w:pPr>
-        <w:spacing w:line="240" w:lineRule="auto"/>
-        <w:jc w:val="both"/>
-        <w:rPr>
-          <w:rFonts w:ascii="Times New Roman" w:hAnsi="Times New Roman" w:cs="Times New Roman"/>
-          <w:sz w:val="32"/>
-          <w:szCs w:val="32"/>
-        </w:rPr>
-      </w:pPr>
-    </w:p>
-    <w:p>
-      <w:pPr>
-        <w:spacing w:line="240" w:lineRule="auto"/>
-        <w:jc w:val="both"/>
-        <w:rPr>
-          <w:rFonts w:ascii="Times New Roman" w:hAnsi="Times New Roman" w:cs="Times New Roman"/>
-          <w:sz w:val="32"/>
-          <w:szCs w:val="32"/>
-        </w:rPr>
-      </w:pPr>
-    </w:p>
-    <w:p>
-      <w:pPr>
-        <w:spacing w:line="240" w:lineRule="auto"/>
-        <w:jc w:val="both"/>
-        <w:rPr>
-          <w:rFonts w:ascii="Times New Roman" w:hAnsi="Times New Roman" w:cs="Times New Roman"/>
-          <w:sz w:val="32"/>
-          <w:szCs w:val="32"/>
-        </w:rPr>
-      </w:pPr>
-    </w:p>
-    <w:tbl>
-      <w:tblPr>
-        <w:tblStyle w:val="a8"/>
-        <w:tblW w:w="0" w:type="auto"/>
-        <w:tblBorders>
-          <w:top w:val="none" w:sz="0" w:space="0" w:color="auto"/>
-          <w:left w:val="none" w:sz="0" w:space="0" w:color="auto"/>
-          <w:bottom w:val="none" w:sz="0" w:space="0" w:color="auto"/>
-          <w:right w:val="none" w:sz="0" w:space="0" w:color="auto"/>
-          <w:insideH w:val="none" w:sz="0" w:space="0" w:color="auto"/>
-          <w:insideV w:val="none" w:sz="0" w:space="0" w:color="auto"/>
-        </w:tblBorders>
-        <w:tblLook w:val="04A0" w:firstRow="1" w:lastRow="0" w:firstColumn="1" w:lastColumn="0" w:noHBand="0" w:noVBand="1"/>
-      </w:tblPr>
-      <w:tblGrid>
-        <w:gridCol w:w="5013"/>
-        <w:gridCol w:w="4558"/>
-      </w:tblGrid>
-      <w:tr>
-        <w:tc>
-          <w:tcPr>
-            <w:tcW w:w="6546" w:type="dxa"/>
-          </w:tcPr>
-          <w:p>
-            <w:pPr>
-              <w:spacing w:line="240" w:lineRule="auto"/>
-              <w:jc w:val="center"/>
-              <w:rPr>
-                <w:rFonts w:ascii="Times New Roman" w:hAnsi="Times New Roman" w:cs="Times New Roman"/>
-                <w:b/>
-                <w:bCs/>
-                <w:sz w:val="32"/>
-                <w:szCs w:val="32"/>
-              </w:rPr>
-            </w:pPr>
-            <w:r>
-              <w:rPr>
-                <w:rFonts w:ascii="Times New Roman" w:hAnsi="Times New Roman" w:cs="Times New Roman"/>
-                <w:b/>
-                <w:bCs/>
-                <w:noProof/>
-                <w:sz w:val="32"/>
-                <w:szCs w:val="32"/>
-              </w:rPr>
-              <w:lastRenderedPageBreak/>
-              <w:drawing>
-                <wp:inline distT="0" distB="0" distL="0" distR="0" wp14:anchorId="35D827FE" wp14:editId="68C8ABAE">
-                  <wp:extent cx="3057525" cy="1560745"/>
-                  <wp:effectExtent l="0" t="0" r="0" b="1905"/>
-                  <wp:docPr id="2128709563" name="Рисунок 24"/>
-                  <wp:cNvGraphicFramePr>
-                    <a:graphicFrameLocks xmlns:a="http://schemas.openxmlformats.org/drawingml/2006/main" noChangeAspect="1"/>
-                  </wp:cNvGraphicFramePr>
-                  <a:graphic xmlns:a="http://schemas.openxmlformats.org/drawingml/2006/main">
-                    <a:graphicData uri="http://schemas.openxmlformats.org/drawingml/2006/picture">
-                      <pic:pic xmlns:pic="http://schemas.openxmlformats.org/drawingml/2006/picture">
-                        <pic:nvPicPr>
-                          <pic:cNvPr id="0" name="Picture 43"/>
-                          <pic:cNvPicPr>
-                            <a:picLocks noChangeAspect="1" noChangeArrowheads="1"/>
-                          </pic:cNvPicPr>
-                        </pic:nvPicPr>
-                        <pic:blipFill>
-                          <a:blip r:embed="rId22">
-                            <a:extLst>
-                              <a:ext uri="{28A0092B-C50C-407E-A947-70E740481C1C}">
-                                <a14:useLocalDpi xmlns:a14="http://schemas.microsoft.com/office/drawing/2010/main" val="0"/>
-                              </a:ext>
-                            </a:extLst>
-                          </a:blip>
-                          <a:srcRect/>
-                          <a:stretch>
-                            <a:fillRect/>
-                          </a:stretch>
-                        </pic:blipFill>
-                        <pic:spPr bwMode="auto">
-                          <a:xfrm>
-                            <a:off x="0" y="0"/>
-                            <a:ext cx="3067882" cy="1566032"/>
-                          </a:xfrm>
-                          <a:prstGeom prst="rect">
-                            <a:avLst/>
-                          </a:prstGeom>
-                          <a:noFill/>
-                          <a:ln>
-                            <a:noFill/>
-                          </a:ln>
-                        </pic:spPr>
-                      </pic:pic>
-                    </a:graphicData>
-                  </a:graphic>
-                </wp:inline>
-              </w:drawing>
-            </w:r>
-          </w:p>
-        </w:tc>
-        <w:tc>
-          <w:tcPr>
-            <w:tcW w:w="3025" w:type="dxa"/>
-          </w:tcPr>
-          <w:p>
-            <w:pPr>
-              <w:spacing w:line="240" w:lineRule="auto"/>
-              <w:jc w:val="both"/>
-              <w:rPr>
-                <w:rFonts w:ascii="Times New Roman" w:hAnsi="Times New Roman" w:cs="Times New Roman"/>
-                <w:b/>
-                <w:bCs/>
-                <w:sz w:val="32"/>
-                <w:szCs w:val="32"/>
-              </w:rPr>
-            </w:pPr>
-            <w:r>
-              <w:rPr>
-                <w:rFonts w:ascii="Times New Roman" w:hAnsi="Times New Roman" w:cs="Times New Roman"/>
-                <w:b/>
-                <w:bCs/>
-                <w:noProof/>
-                <w:sz w:val="32"/>
-                <w:szCs w:val="32"/>
-              </w:rPr>
-              <w:drawing>
-                <wp:inline distT="0" distB="0" distL="0" distR="0" wp14:anchorId="12879138" wp14:editId="628DFE7F">
-                  <wp:extent cx="2657475" cy="1480754"/>
-                  <wp:effectExtent l="0" t="0" r="0" b="5715"/>
-                  <wp:docPr id="2064947947" name="Рисунок 26"/>
-                  <wp:cNvGraphicFramePr>
-                    <a:graphicFrameLocks xmlns:a="http://schemas.openxmlformats.org/drawingml/2006/main" noChangeAspect="1"/>
-                  </wp:cNvGraphicFramePr>
-                  <a:graphic xmlns:a="http://schemas.openxmlformats.org/drawingml/2006/main">
-                    <a:graphicData uri="http://schemas.openxmlformats.org/drawingml/2006/picture">
-                      <pic:pic xmlns:pic="http://schemas.openxmlformats.org/drawingml/2006/picture">
-                        <pic:nvPicPr>
-                          <pic:cNvPr id="0" name="Picture 45"/>
-                          <pic:cNvPicPr>
-                            <a:picLocks noChangeAspect="1" noChangeArrowheads="1"/>
-                          </pic:cNvPicPr>
-                        </pic:nvPicPr>
-                        <pic:blipFill>
-                          <a:blip r:embed="rId23">
-                            <a:extLst>
-                              <a:ext uri="{28A0092B-C50C-407E-A947-70E740481C1C}">
-                                <a14:useLocalDpi xmlns:a14="http://schemas.microsoft.com/office/drawing/2010/main" val="0"/>
-                              </a:ext>
-                            </a:extLst>
-                          </a:blip>
-                          <a:srcRect/>
-                          <a:stretch>
-                            <a:fillRect/>
-                          </a:stretch>
-                        </pic:blipFill>
-                        <pic:spPr bwMode="auto">
-                          <a:xfrm>
-                            <a:off x="0" y="0"/>
-                            <a:ext cx="2669396" cy="1487397"/>
-                          </a:xfrm>
-                          <a:prstGeom prst="rect">
-                            <a:avLst/>
-                          </a:prstGeom>
-                          <a:noFill/>
-                          <a:ln>
-                            <a:noFill/>
-                          </a:ln>
-                        </pic:spPr>
-                      </pic:pic>
-                    </a:graphicData>
-                  </a:graphic>
-                </wp:inline>
-              </w:drawing>
-            </w:r>
-          </w:p>
-        </w:tc>
-      </w:tr>
-      <w:tr>
-        <w:trPr>
-          <w:trHeight w:val="2332"/>
-        </w:trPr>
-        <w:tc>
-          <w:tcPr>
-            <w:tcW w:w="6546" w:type="dxa"/>
-          </w:tcPr>
-          <w:p>
-            <w:pPr>
-              <w:spacing w:line="240" w:lineRule="auto"/>
-              <w:jc w:val="center"/>
-              <w:rPr>
-                <w:rFonts w:ascii="Times New Roman" w:hAnsi="Times New Roman" w:cs="Times New Roman"/>
-                <w:b/>
-                <w:bCs/>
-                <w:sz w:val="32"/>
-                <w:szCs w:val="32"/>
-              </w:rPr>
-            </w:pPr>
-            <w:r>
-              <w:rPr>
-                <w:rFonts w:ascii="Times New Roman" w:hAnsi="Times New Roman" w:cs="Times New Roman"/>
-                <w:b/>
-                <w:bCs/>
-                <w:noProof/>
-                <w:sz w:val="32"/>
-                <w:szCs w:val="32"/>
-              </w:rPr>
-              <w:drawing>
-                <wp:inline distT="0" distB="0" distL="0" distR="0" wp14:anchorId="2403FFF0" wp14:editId="204A987D">
-                  <wp:extent cx="2686050" cy="1413401"/>
-                  <wp:effectExtent l="0" t="0" r="0" b="0"/>
-                  <wp:docPr id="61633901" name="Рисунок 23"/>
-                  <wp:cNvGraphicFramePr>
-                    <a:graphicFrameLocks xmlns:a="http://schemas.openxmlformats.org/drawingml/2006/main" noChangeAspect="1"/>
-                  </wp:cNvGraphicFramePr>
-                  <a:graphic xmlns:a="http://schemas.openxmlformats.org/drawingml/2006/main">
-                    <a:graphicData uri="http://schemas.openxmlformats.org/drawingml/2006/picture">
-                      <pic:pic xmlns:pic="http://schemas.openxmlformats.org/drawingml/2006/picture">
-                        <pic:nvPicPr>
-                          <pic:cNvPr id="0" name="Picture 42"/>
-                          <pic:cNvPicPr>
-                            <a:picLocks noChangeAspect="1" noChangeArrowheads="1"/>
-                          </pic:cNvPicPr>
-                        </pic:nvPicPr>
-                        <pic:blipFill>
-                          <a:blip r:embed="rId24">
-                            <a:extLst>
-                              <a:ext uri="{28A0092B-C50C-407E-A947-70E740481C1C}">
-                                <a14:useLocalDpi xmlns:a14="http://schemas.microsoft.com/office/drawing/2010/main" val="0"/>
-                              </a:ext>
-                            </a:extLst>
-                          </a:blip>
-                          <a:srcRect/>
-                          <a:stretch>
-                            <a:fillRect/>
-                          </a:stretch>
-                        </pic:blipFill>
-                        <pic:spPr bwMode="auto">
-                          <a:xfrm>
-                            <a:off x="0" y="0"/>
-                            <a:ext cx="2704398" cy="1423056"/>
-                          </a:xfrm>
-                          <a:prstGeom prst="rect">
-                            <a:avLst/>
-                          </a:prstGeom>
-                          <a:noFill/>
-                          <a:ln>
-                            <a:noFill/>
-                          </a:ln>
-                        </pic:spPr>
-                      </pic:pic>
-                    </a:graphicData>
-                  </a:graphic>
-                </wp:inline>
-              </w:drawing>
-            </w:r>
-          </w:p>
-        </w:tc>
-        <w:tc>
-          <w:tcPr>
-            <w:tcW w:w="3025" w:type="dxa"/>
-          </w:tcPr>
-          <w:p>
-            <w:pPr>
-              <w:spacing w:line="240" w:lineRule="auto"/>
-              <w:jc w:val="both"/>
-              <w:rPr>
-                <w:rFonts w:ascii="Times New Roman" w:hAnsi="Times New Roman" w:cs="Times New Roman"/>
-                <w:b/>
-                <w:bCs/>
-                <w:sz w:val="32"/>
-                <w:szCs w:val="32"/>
-              </w:rPr>
-            </w:pPr>
-            <w:r>
-              <w:rPr>
-                <w:rFonts w:ascii="Times New Roman" w:hAnsi="Times New Roman" w:cs="Times New Roman"/>
-                <w:b/>
-                <w:bCs/>
-                <w:noProof/>
-                <w:sz w:val="32"/>
-                <w:szCs w:val="32"/>
-              </w:rPr>
-              <w:drawing>
-                <wp:inline distT="0" distB="0" distL="0" distR="0" wp14:anchorId="75A7FB8D" wp14:editId="51330E5B">
-                  <wp:extent cx="2768545" cy="1390650"/>
-                  <wp:effectExtent l="0" t="0" r="0" b="0"/>
-                  <wp:docPr id="1431191375" name="Рисунок 25"/>
-                  <wp:cNvGraphicFramePr>
-                    <a:graphicFrameLocks xmlns:a="http://schemas.openxmlformats.org/drawingml/2006/main" noChangeAspect="1"/>
-                  </wp:cNvGraphicFramePr>
-                  <a:graphic xmlns:a="http://schemas.openxmlformats.org/drawingml/2006/main">
-                    <a:graphicData uri="http://schemas.openxmlformats.org/drawingml/2006/picture">
-                      <pic:pic xmlns:pic="http://schemas.openxmlformats.org/drawingml/2006/picture">
-                        <pic:nvPicPr>
-                          <pic:cNvPr id="0" name="Picture 44"/>
-                          <pic:cNvPicPr>
-                            <a:picLocks noChangeAspect="1" noChangeArrowheads="1"/>
-                          </pic:cNvPicPr>
-                        </pic:nvPicPr>
-                        <pic:blipFill>
-                          <a:blip r:embed="rId25">
-                            <a:extLst>
-                              <a:ext uri="{28A0092B-C50C-407E-A947-70E740481C1C}">
-                                <a14:useLocalDpi xmlns:a14="http://schemas.microsoft.com/office/drawing/2010/main" val="0"/>
-                              </a:ext>
-                            </a:extLst>
-                          </a:blip>
-                          <a:srcRect/>
-                          <a:stretch>
-                            <a:fillRect/>
-                          </a:stretch>
-                        </pic:blipFill>
-                        <pic:spPr bwMode="auto">
-                          <a:xfrm>
-                            <a:off x="0" y="0"/>
-                            <a:ext cx="2807690" cy="1410313"/>
-                          </a:xfrm>
-                          <a:prstGeom prst="rect">
-                            <a:avLst/>
-                          </a:prstGeom>
-                          <a:noFill/>
-                          <a:ln>
-                            <a:noFill/>
-                          </a:ln>
-                        </pic:spPr>
-                      </pic:pic>
-                    </a:graphicData>
-                  </a:graphic>
-                </wp:inline>
-              </w:drawing>
-            </w:r>
-          </w:p>
-        </w:tc>
-      </w:tr>
-      <w:tr>
-        <w:trPr>
-          <w:trHeight w:val="545"/>
-        </w:trPr>
-        <w:tc>
-          <w:tcPr>
-            <w:tcW w:w="9571" w:type="dxa"/>
-            <w:gridSpan w:val="2"/>
-          </w:tcPr>
-          <w:p>
-            <w:pPr>
-              <w:spacing w:line="240" w:lineRule="auto"/>
-              <w:jc w:val="both"/>
-              <w:rPr>
-                <w:rFonts w:ascii="Times New Roman" w:hAnsi="Times New Roman" w:cs="Times New Roman"/>
-                <w:sz w:val="32"/>
-                <w:szCs w:val="32"/>
-              </w:rPr>
-            </w:pPr>
-            <w:r>
-              <w:rPr>
-                <w:rFonts w:ascii="Times New Roman" w:hAnsi="Times New Roman" w:cs="Times New Roman"/>
-                <w:sz w:val="28"/>
-                <w:szCs w:val="28"/>
-              </w:rPr>
-              <w:t xml:space="preserve">Рисунок </w:t>
+              <w:t xml:space="preserve">: </w:t>
             </w:r>
             <w:r>
               <w:rPr>
@@ -25560,7 +24885,7 @@
                 <w:sz w:val="28"/>
                 <w:szCs w:val="28"/>
               </w:rPr>
-              <w:t>3</w:t>
+              <w:t xml:space="preserve">Графики зависимости времени добавления и поиска элементов в контейнерах от числа элементов: </w:t>
             </w:r>
             <w:r>
               <w:rPr>
@@ -25568,28 +24893,163 @@
                 <w:sz w:val="28"/>
                 <w:szCs w:val="28"/>
               </w:rPr>
-              <w:t xml:space="preserve"> – Эксперимент </w:t>
+              <w:t>2</w:t>
             </w:r>
             <w:r>
               <w:rPr>
                 <w:rFonts w:ascii="Times New Roman" w:hAnsi="Times New Roman" w:cs="Times New Roman"/>
+                <w:b/>
+                <w:bCs/>
                 <w:sz w:val="28"/>
                 <w:szCs w:val="28"/>
               </w:rPr>
-              <w:t>3</w:t>
+              <w:t>0 000-</w:t>
             </w:r>
             <w:r>
               <w:rPr>
                 <w:rFonts w:ascii="Times New Roman" w:hAnsi="Times New Roman" w:cs="Times New Roman"/>
+                <w:b/>
+                <w:bCs/>
                 <w:sz w:val="28"/>
                 <w:szCs w:val="28"/>
               </w:rPr>
-              <w:t>: Графики зависимости времени добавления и поиска элементов в заданных контейнерах от числа элементов в контейнерах</w:t>
+              <w:t>2</w:t>
+            </w:r>
+            <w:r>
+              <w:rPr>
+                <w:rFonts w:ascii="Times New Roman" w:hAnsi="Times New Roman" w:cs="Times New Roman"/>
+                <w:b/>
+                <w:bCs/>
+                <w:sz w:val="28"/>
+                <w:szCs w:val="28"/>
+              </w:rPr>
+              <w:t>00 000</w:t>
             </w:r>
           </w:p>
         </w:tc>
       </w:tr>
     </w:tbl>
+    <w:p>
+      <w:pPr>
+        <w:spacing w:line="240" w:lineRule="auto"/>
+        <w:jc w:val="center"/>
+        <w:rPr>
+          <w:rFonts w:ascii="Times New Roman" w:hAnsi="Times New Roman" w:cs="Times New Roman"/>
+          <w:sz w:val="28"/>
+          <w:szCs w:val="28"/>
+        </w:rPr>
+      </w:pPr>
+    </w:p>
+    <w:p>
+      <w:pPr>
+        <w:spacing w:line="240" w:lineRule="auto"/>
+        <w:jc w:val="both"/>
+        <w:rPr>
+          <w:rFonts w:ascii="Times New Roman" w:hAnsi="Times New Roman" w:cs="Times New Roman"/>
+          <w:sz w:val="20"/>
+          <w:szCs w:val="20"/>
+        </w:rPr>
+      </w:pPr>
+    </w:p>
+    <w:p>
+      <w:pPr>
+        <w:spacing w:line="240" w:lineRule="auto"/>
+        <w:jc w:val="both"/>
+        <w:rPr>
+          <w:rFonts w:ascii="Times New Roman" w:hAnsi="Times New Roman" w:cs="Times New Roman"/>
+          <w:sz w:val="32"/>
+          <w:szCs w:val="32"/>
+        </w:rPr>
+      </w:pPr>
+    </w:p>
+    <w:p>
+      <w:pPr>
+        <w:spacing w:line="240" w:lineRule="auto"/>
+        <w:jc w:val="both"/>
+        <w:rPr>
+          <w:rFonts w:ascii="Times New Roman" w:hAnsi="Times New Roman" w:cs="Times New Roman"/>
+          <w:sz w:val="32"/>
+          <w:szCs w:val="32"/>
+        </w:rPr>
+      </w:pPr>
+    </w:p>
+    <w:p>
+      <w:pPr>
+        <w:spacing w:line="240" w:lineRule="auto"/>
+        <w:jc w:val="both"/>
+        <w:rPr>
+          <w:rFonts w:ascii="Times New Roman" w:hAnsi="Times New Roman" w:cs="Times New Roman"/>
+          <w:sz w:val="32"/>
+          <w:szCs w:val="32"/>
+        </w:rPr>
+      </w:pPr>
+    </w:p>
+    <w:p>
+      <w:pPr>
+        <w:spacing w:line="240" w:lineRule="auto"/>
+        <w:jc w:val="both"/>
+        <w:rPr>
+          <w:rFonts w:ascii="Times New Roman" w:hAnsi="Times New Roman" w:cs="Times New Roman"/>
+          <w:sz w:val="32"/>
+          <w:szCs w:val="32"/>
+        </w:rPr>
+      </w:pPr>
+    </w:p>
+    <w:p>
+      <w:pPr>
+        <w:spacing w:line="240" w:lineRule="auto"/>
+        <w:jc w:val="both"/>
+        <w:rPr>
+          <w:rFonts w:ascii="Times New Roman" w:hAnsi="Times New Roman" w:cs="Times New Roman"/>
+          <w:sz w:val="32"/>
+          <w:szCs w:val="32"/>
+        </w:rPr>
+      </w:pPr>
+    </w:p>
+    <w:p>
+      <w:pPr>
+        <w:spacing w:line="240" w:lineRule="auto"/>
+        <w:jc w:val="both"/>
+        <w:rPr>
+          <w:rFonts w:ascii="Times New Roman" w:hAnsi="Times New Roman" w:cs="Times New Roman"/>
+          <w:sz w:val="32"/>
+          <w:szCs w:val="32"/>
+        </w:rPr>
+      </w:pPr>
+    </w:p>
+    <w:p>
+      <w:pPr>
+        <w:spacing w:line="240" w:lineRule="auto"/>
+        <w:jc w:val="both"/>
+        <w:rPr>
+          <w:rFonts w:ascii="Times New Roman" w:hAnsi="Times New Roman" w:cs="Times New Roman"/>
+          <w:sz w:val="32"/>
+          <w:szCs w:val="32"/>
+        </w:rPr>
+      </w:pPr>
+    </w:p>
+    <w:p>
+      <w:pPr>
+        <w:spacing w:line="240" w:lineRule="auto"/>
+        <w:jc w:val="both"/>
+        <w:rPr>
+          <w:rFonts w:ascii="Times New Roman" w:hAnsi="Times New Roman" w:cs="Times New Roman"/>
+          <w:sz w:val="32"/>
+          <w:szCs w:val="32"/>
+        </w:rPr>
+      </w:pPr>
+    </w:p>
+    <w:p>
+      <w:pPr>
+        <w:spacing w:line="240" w:lineRule="auto"/>
+        <w:jc w:val="both"/>
+        <w:rPr>
+          <w:rFonts w:ascii="Times New Roman" w:hAnsi="Times New Roman" w:cs="Times New Roman"/>
+          <w:sz w:val="32"/>
+          <w:szCs w:val="32"/>
+        </w:rPr>
+      </w:pPr>
+    </w:p>
     <w:p>
       <w:pPr>
         <w:spacing w:line="240" w:lineRule="auto"/>
@@ -26216,6 +25676,95 @@
     </w:lvl>
   </w:abstractNum>
   <w:abstractNum w:abstractNumId="5" w15:restartNumberingAfterBreak="0">
+    <w:nsid w:val="1CD00B37"/>
+    <w:multiLevelType w:val="hybridMultilevel"/>
+    <w:tmpl w:val="3360797E"/>
+    <w:lvl w:ilvl="0" w:tplc="04190011">
+      <w:start w:val="1"/>
+      <w:numFmt w:val="decimal"/>
+      <w:lvlText w:val="%1)"/>
+      <w:lvlJc w:val="left"/>
+      <w:pPr>
+        <w:ind w:left="720" w:hanging="360"/>
+      </w:pPr>
+      <w:rPr>
+        <w:rFonts w:hint="default"/>
+      </w:rPr>
+    </w:lvl>
+    <w:lvl w:ilvl="1" w:tplc="04190019" w:tentative="1">
+      <w:start w:val="1"/>
+      <w:numFmt w:val="lowerLetter"/>
+      <w:lvlText w:val="%2."/>
+      <w:lvlJc w:val="left"/>
+      <w:pPr>
+        <w:ind w:left="1440" w:hanging="360"/>
+      </w:pPr>
+    </w:lvl>
+    <w:lvl w:ilvl="2" w:tplc="0419001B" w:tentative="1">
+      <w:start w:val="1"/>
+      <w:numFmt w:val="lowerRoman"/>
+      <w:lvlText w:val="%3."/>
+      <w:lvlJc w:val="right"/>
+      <w:pPr>
+        <w:ind w:left="2160" w:hanging="180"/>
+      </w:pPr>
+    </w:lvl>
+    <w:lvl w:ilvl="3" w:tplc="0419000F" w:tentative="1">
+      <w:start w:val="1"/>
+      <w:numFmt w:val="decimal"/>
+      <w:lvlText w:val="%4."/>
+      <w:lvlJc w:val="left"/>
+      <w:pPr>
+        <w:ind w:left="2880" w:hanging="360"/>
+      </w:pPr>
+    </w:lvl>
+    <w:lvl w:ilvl="4" w:tplc="04190019" w:tentative="1">
+      <w:start w:val="1"/>
+      <w:numFmt w:val="lowerLetter"/>
+      <w:lvlText w:val="%5."/>
+      <w:lvlJc w:val="left"/>
+      <w:pPr>
+        <w:ind w:left="3600" w:hanging="360"/>
+      </w:pPr>
+    </w:lvl>
+    <w:lvl w:ilvl="5" w:tplc="0419001B" w:tentative="1">
+      <w:start w:val="1"/>
+      <w:numFmt w:val="lowerRoman"/>
+      <w:lvlText w:val="%6."/>
+      <w:lvlJc w:val="right"/>
+      <w:pPr>
+        <w:ind w:left="4320" w:hanging="180"/>
+      </w:pPr>
+    </w:lvl>
+    <w:lvl w:ilvl="6" w:tplc="0419000F" w:tentative="1">
+      <w:start w:val="1"/>
+      <w:numFmt w:val="decimal"/>
+      <w:lvlText w:val="%7."/>
+      <w:lvlJc w:val="left"/>
+      <w:pPr>
+        <w:ind w:left="5040" w:hanging="360"/>
+      </w:pPr>
+    </w:lvl>
+    <w:lvl w:ilvl="7" w:tplc="04190019" w:tentative="1">
+      <w:start w:val="1"/>
+      <w:numFmt w:val="lowerLetter"/>
+      <w:lvlText w:val="%8."/>
+      <w:lvlJc w:val="left"/>
+      <w:pPr>
+        <w:ind w:left="5760" w:hanging="360"/>
+      </w:pPr>
+    </w:lvl>
+    <w:lvl w:ilvl="8" w:tplc="0419001B" w:tentative="1">
+      <w:start w:val="1"/>
+      <w:numFmt w:val="lowerRoman"/>
+      <w:lvlText w:val="%9."/>
+      <w:lvlJc w:val="right"/>
+      <w:pPr>
+        <w:ind w:left="6480" w:hanging="180"/>
+      </w:pPr>
+    </w:lvl>
+  </w:abstractNum>
+  <w:abstractNum w:abstractNumId="6" w15:restartNumberingAfterBreak="0">
     <w:nsid w:val="1D2A0F10"/>
     <w:multiLevelType w:val="multilevel"/>
     <w:tmpl w:val="25383A84"/>
@@ -26364,7 +25913,7 @@
       </w:rPr>
     </w:lvl>
   </w:abstractNum>
-  <w:abstractNum w:abstractNumId="6" w15:restartNumberingAfterBreak="0">
+  <w:abstractNum w:abstractNumId="7" w15:restartNumberingAfterBreak="0">
     <w:nsid w:val="1EE740F3"/>
     <w:multiLevelType w:val="hybridMultilevel"/>
     <w:tmpl w:val="B232DE00"/>
@@ -26477,7 +26026,7 @@
       </w:rPr>
     </w:lvl>
   </w:abstractNum>
-  <w:abstractNum w:abstractNumId="7" w15:restartNumberingAfterBreak="0">
+  <w:abstractNum w:abstractNumId="8" w15:restartNumberingAfterBreak="0">
     <w:nsid w:val="209B18B1"/>
     <w:multiLevelType w:val="multilevel"/>
     <w:tmpl w:val="E2CEADC0"/>
@@ -26626,7 +26175,7 @@
       </w:rPr>
     </w:lvl>
   </w:abstractNum>
-  <w:abstractNum w:abstractNumId="8" w15:restartNumberingAfterBreak="0">
+  <w:abstractNum w:abstractNumId="9" w15:restartNumberingAfterBreak="0">
     <w:nsid w:val="22FC5974"/>
     <w:multiLevelType w:val="hybridMultilevel"/>
     <w:tmpl w:val="F6A25AC0"/>
@@ -26739,7 +26288,7 @@
       </w:rPr>
     </w:lvl>
   </w:abstractNum>
-  <w:abstractNum w:abstractNumId="9" w15:restartNumberingAfterBreak="0">
+  <w:abstractNum w:abstractNumId="10" w15:restartNumberingAfterBreak="0">
     <w:nsid w:val="279F2AEA"/>
     <w:multiLevelType w:val="multilevel"/>
     <w:tmpl w:val="1318ECF0"/>
@@ -26888,7 +26437,7 @@
       </w:rPr>
     </w:lvl>
   </w:abstractNum>
-  <w:abstractNum w:abstractNumId="10" w15:restartNumberingAfterBreak="0">
+  <w:abstractNum w:abstractNumId="11" w15:restartNumberingAfterBreak="0">
     <w:nsid w:val="29A84646"/>
     <w:multiLevelType w:val="multilevel"/>
     <w:tmpl w:val="5A3AF3C2"/>
@@ -27037,7 +26586,7 @@
       </w:rPr>
     </w:lvl>
   </w:abstractNum>
-  <w:abstractNum w:abstractNumId="11" w15:restartNumberingAfterBreak="0">
+  <w:abstractNum w:abstractNumId="12" w15:restartNumberingAfterBreak="0">
     <w:nsid w:val="2E552FBD"/>
     <w:multiLevelType w:val="multilevel"/>
     <w:tmpl w:val="4094ECF0"/>
@@ -27150,7 +26699,7 @@
       </w:pPr>
     </w:lvl>
   </w:abstractNum>
-  <w:abstractNum w:abstractNumId="12" w15:restartNumberingAfterBreak="0">
+  <w:abstractNum w:abstractNumId="13" w15:restartNumberingAfterBreak="0">
     <w:nsid w:val="329D5C7D"/>
     <w:multiLevelType w:val="multilevel"/>
     <w:tmpl w:val="EA8C9FB0"/>
@@ -27299,7 +26848,7 @@
       </w:rPr>
     </w:lvl>
   </w:abstractNum>
-  <w:abstractNum w:abstractNumId="13" w15:restartNumberingAfterBreak="0">
+  <w:abstractNum w:abstractNumId="14" w15:restartNumberingAfterBreak="0">
     <w:nsid w:val="34B128AB"/>
     <w:multiLevelType w:val="multilevel"/>
     <w:tmpl w:val="C0FE4EDC"/>
@@ -27448,7 +26997,7 @@
       </w:rPr>
     </w:lvl>
   </w:abstractNum>
-  <w:abstractNum w:abstractNumId="14" w15:restartNumberingAfterBreak="0">
+  <w:abstractNum w:abstractNumId="15" w15:restartNumberingAfterBreak="0">
     <w:nsid w:val="361B5AD5"/>
     <w:multiLevelType w:val="multilevel"/>
     <w:tmpl w:val="C644D896"/>
@@ -27597,7 +27146,7 @@
       </w:rPr>
     </w:lvl>
   </w:abstractNum>
-  <w:abstractNum w:abstractNumId="15" w15:restartNumberingAfterBreak="0">
+  <w:abstractNum w:abstractNumId="16" w15:restartNumberingAfterBreak="0">
     <w:nsid w:val="38B663F6"/>
     <w:multiLevelType w:val="multilevel"/>
     <w:tmpl w:val="36CA64B6"/>
@@ -27746,7 +27295,7 @@
       </w:rPr>
     </w:lvl>
   </w:abstractNum>
-  <w:abstractNum w:abstractNumId="16" w15:restartNumberingAfterBreak="0">
+  <w:abstractNum w:abstractNumId="17" w15:restartNumberingAfterBreak="0">
     <w:nsid w:val="3B3C22E3"/>
     <w:multiLevelType w:val="multilevel"/>
     <w:tmpl w:val="16FC081A"/>
@@ -27895,7 +27444,7 @@
       </w:rPr>
     </w:lvl>
   </w:abstractNum>
-  <w:abstractNum w:abstractNumId="17" w15:restartNumberingAfterBreak="0">
+  <w:abstractNum w:abstractNumId="18" w15:restartNumberingAfterBreak="0">
     <w:nsid w:val="3D8E2907"/>
     <w:multiLevelType w:val="multilevel"/>
     <w:tmpl w:val="5FA4A412"/>
@@ -28044,7 +27593,7 @@
       </w:rPr>
     </w:lvl>
   </w:abstractNum>
-  <w:abstractNum w:abstractNumId="18" w15:restartNumberingAfterBreak="0">
+  <w:abstractNum w:abstractNumId="19" w15:restartNumberingAfterBreak="0">
     <w:nsid w:val="3D994F08"/>
     <w:multiLevelType w:val="multilevel"/>
     <w:tmpl w:val="4D6C7726"/>
@@ -28161,7 +27710,7 @@
       </w:pPr>
     </w:lvl>
   </w:abstractNum>
-  <w:abstractNum w:abstractNumId="19" w15:restartNumberingAfterBreak="0">
+  <w:abstractNum w:abstractNumId="20" w15:restartNumberingAfterBreak="0">
     <w:nsid w:val="43E44EEE"/>
     <w:multiLevelType w:val="hybridMultilevel"/>
     <w:tmpl w:val="41E1889B"/>
@@ -28212,7 +27761,7 @@
       <w:lvlJc w:val="left"/>
     </w:lvl>
   </w:abstractNum>
-  <w:abstractNum w:abstractNumId="20" w15:restartNumberingAfterBreak="0">
+  <w:abstractNum w:abstractNumId="21" w15:restartNumberingAfterBreak="0">
     <w:nsid w:val="45DD6A26"/>
     <w:multiLevelType w:val="multilevel"/>
     <w:tmpl w:val="258E3F52"/>
@@ -28361,7 +27910,7 @@
       </w:rPr>
     </w:lvl>
   </w:abstractNum>
-  <w:abstractNum w:abstractNumId="21" w15:restartNumberingAfterBreak="0">
+  <w:abstractNum w:abstractNumId="22" w15:restartNumberingAfterBreak="0">
     <w:nsid w:val="4DD94C77"/>
     <w:multiLevelType w:val="hybridMultilevel"/>
     <w:tmpl w:val="71CE4564"/>
@@ -28474,7 +28023,7 @@
       </w:rPr>
     </w:lvl>
   </w:abstractNum>
-  <w:abstractNum w:abstractNumId="22" w15:restartNumberingAfterBreak="0">
+  <w:abstractNum w:abstractNumId="23" w15:restartNumberingAfterBreak="0">
     <w:nsid w:val="4FC92011"/>
     <w:multiLevelType w:val="multilevel"/>
     <w:tmpl w:val="E8688E46"/>
@@ -28587,7 +28136,7 @@
       </w:pPr>
     </w:lvl>
   </w:abstractNum>
-  <w:abstractNum w:abstractNumId="23" w15:restartNumberingAfterBreak="0">
+  <w:abstractNum w:abstractNumId="24" w15:restartNumberingAfterBreak="0">
     <w:nsid w:val="568B62BF"/>
     <w:multiLevelType w:val="hybridMultilevel"/>
     <w:tmpl w:val="BF386CBC"/>
@@ -28699,7 +28248,7 @@
       </w:rPr>
     </w:lvl>
   </w:abstractNum>
-  <w:abstractNum w:abstractNumId="24" w15:restartNumberingAfterBreak="0">
+  <w:abstractNum w:abstractNumId="25" w15:restartNumberingAfterBreak="0">
     <w:nsid w:val="5C5741A0"/>
     <w:multiLevelType w:val="hybridMultilevel"/>
     <w:tmpl w:val="B3E6276E"/>
@@ -28812,7 +28361,7 @@
       </w:rPr>
     </w:lvl>
   </w:abstractNum>
-  <w:abstractNum w:abstractNumId="25" w15:restartNumberingAfterBreak="0">
+  <w:abstractNum w:abstractNumId="26" w15:restartNumberingAfterBreak="0">
     <w:nsid w:val="5DF9545C"/>
     <w:multiLevelType w:val="hybridMultilevel"/>
     <w:tmpl w:val="2AAA3170"/>
@@ -28925,7 +28474,7 @@
       </w:rPr>
     </w:lvl>
   </w:abstractNum>
-  <w:abstractNum w:abstractNumId="26" w15:restartNumberingAfterBreak="0">
+  <w:abstractNum w:abstractNumId="27" w15:restartNumberingAfterBreak="0">
     <w:nsid w:val="63712390"/>
     <w:multiLevelType w:val="hybridMultilevel"/>
     <w:tmpl w:val="E3EC7CC8"/>
@@ -29038,7 +28587,7 @@
       </w:rPr>
     </w:lvl>
   </w:abstractNum>
-  <w:abstractNum w:abstractNumId="27" w15:restartNumberingAfterBreak="0">
+  <w:abstractNum w:abstractNumId="28" w15:restartNumberingAfterBreak="0">
     <w:nsid w:val="67A31ED1"/>
     <w:multiLevelType w:val="multilevel"/>
     <w:tmpl w:val="0408F9C0"/>
@@ -29187,7 +28736,7 @@
       </w:rPr>
     </w:lvl>
   </w:abstractNum>
-  <w:abstractNum w:abstractNumId="28" w15:restartNumberingAfterBreak="0">
+  <w:abstractNum w:abstractNumId="29" w15:restartNumberingAfterBreak="0">
     <w:nsid w:val="69413818"/>
     <w:multiLevelType w:val="hybridMultilevel"/>
     <w:tmpl w:val="50402BEA"/>
@@ -29300,7 +28849,7 @@
       </w:rPr>
     </w:lvl>
   </w:abstractNum>
-  <w:abstractNum w:abstractNumId="29" w15:restartNumberingAfterBreak="0">
+  <w:abstractNum w:abstractNumId="30" w15:restartNumberingAfterBreak="0">
     <w:nsid w:val="771230A9"/>
     <w:multiLevelType w:val="hybridMultilevel"/>
     <w:tmpl w:val="677A38D0"/>
@@ -29391,7 +28940,7 @@
       </w:pPr>
     </w:lvl>
   </w:abstractNum>
-  <w:abstractNum w:abstractNumId="30" w15:restartNumberingAfterBreak="0">
+  <w:abstractNum w:abstractNumId="31" w15:restartNumberingAfterBreak="0">
     <w:nsid w:val="78163819"/>
     <w:multiLevelType w:val="hybridMultilevel"/>
     <w:tmpl w:val="882A5370"/>
@@ -29504,7 +29053,7 @@
       </w:rPr>
     </w:lvl>
   </w:abstractNum>
-  <w:abstractNum w:abstractNumId="31" w15:restartNumberingAfterBreak="0">
+  <w:abstractNum w:abstractNumId="32" w15:restartNumberingAfterBreak="0">
     <w:nsid w:val="79755638"/>
     <w:multiLevelType w:val="multilevel"/>
     <w:tmpl w:val="E16C7806"/>
@@ -29617,7 +29166,7 @@
       </w:pPr>
     </w:lvl>
   </w:abstractNum>
-  <w:abstractNum w:abstractNumId="32" w15:restartNumberingAfterBreak="0">
+  <w:abstractNum w:abstractNumId="33" w15:restartNumberingAfterBreak="0">
     <w:nsid w:val="7C4A04D5"/>
     <w:multiLevelType w:val="hybridMultilevel"/>
     <w:tmpl w:val="05560FF2"/>
@@ -29731,61 +29280,61 @@
     </w:lvl>
   </w:abstractNum>
   <w:num w:numId="1" w16cid:durableId="1742364032">
-    <w:abstractNumId w:val="30"/>
+    <w:abstractNumId w:val="31"/>
   </w:num>
   <w:num w:numId="2" w16cid:durableId="543758390">
-    <w:abstractNumId w:val="29"/>
+    <w:abstractNumId w:val="30"/>
   </w:num>
   <w:num w:numId="3" w16cid:durableId="2097357967">
     <w:abstractNumId w:val="4"/>
   </w:num>
   <w:num w:numId="4" w16cid:durableId="748230671">
+    <w:abstractNumId w:val="25"/>
+  </w:num>
+  <w:num w:numId="5" w16cid:durableId="1189178330">
     <w:abstractNumId w:val="24"/>
   </w:num>
-  <w:num w:numId="5" w16cid:durableId="1189178330">
-    <w:abstractNumId w:val="23"/>
-  </w:num>
   <w:num w:numId="6" w16cid:durableId="153224043">
-    <w:abstractNumId w:val="13"/>
+    <w:abstractNumId w:val="14"/>
   </w:num>
   <w:num w:numId="7" w16cid:durableId="917635695">
-    <w:abstractNumId w:val="14"/>
+    <w:abstractNumId w:val="15"/>
   </w:num>
   <w:num w:numId="8" w16cid:durableId="1888832253">
-    <w:abstractNumId w:val="31"/>
+    <w:abstractNumId w:val="32"/>
   </w:num>
   <w:num w:numId="9" w16cid:durableId="1015495012">
-    <w:abstractNumId w:val="26"/>
+    <w:abstractNumId w:val="27"/>
   </w:num>
   <w:num w:numId="10" w16cid:durableId="1426921033">
-    <w:abstractNumId w:val="28"/>
+    <w:abstractNumId w:val="29"/>
   </w:num>
   <w:num w:numId="11" w16cid:durableId="1273853465">
-    <w:abstractNumId w:val="10"/>
+    <w:abstractNumId w:val="11"/>
   </w:num>
   <w:num w:numId="12" w16cid:durableId="1468546191">
-    <w:abstractNumId w:val="11"/>
+    <w:abstractNumId w:val="12"/>
   </w:num>
   <w:num w:numId="13" w16cid:durableId="289631411">
-    <w:abstractNumId w:val="19"/>
+    <w:abstractNumId w:val="20"/>
   </w:num>
   <w:num w:numId="14" w16cid:durableId="2113819207">
-    <w:abstractNumId w:val="21"/>
+    <w:abstractNumId w:val="22"/>
   </w:num>
   <w:num w:numId="15" w16cid:durableId="1350063234">
     <w:abstractNumId w:val="1"/>
   </w:num>
   <w:num w:numId="16" w16cid:durableId="1902208768">
-    <w:abstractNumId w:val="25"/>
+    <w:abstractNumId w:val="26"/>
   </w:num>
   <w:num w:numId="17" w16cid:durableId="1572738103">
-    <w:abstractNumId w:val="32"/>
+    <w:abstractNumId w:val="33"/>
   </w:num>
   <w:num w:numId="18" w16cid:durableId="346447368">
-    <w:abstractNumId w:val="9"/>
+    <w:abstractNumId w:val="10"/>
   </w:num>
   <w:num w:numId="19" w16cid:durableId="255409456">
-    <w:abstractNumId w:val="7"/>
+    <w:abstractNumId w:val="8"/>
   </w:num>
   <w:num w:numId="20" w16cid:durableId="1870676167">
     <w:abstractNumId w:val="3"/>
@@ -29794,40 +29343,43 @@
     <w:abstractNumId w:val="2"/>
   </w:num>
   <w:num w:numId="22" w16cid:durableId="305353351">
-    <w:abstractNumId w:val="6"/>
+    <w:abstractNumId w:val="7"/>
   </w:num>
   <w:num w:numId="23" w16cid:durableId="1321890243">
     <w:abstractNumId w:val="0"/>
   </w:num>
   <w:num w:numId="24" w16cid:durableId="1516571905">
-    <w:abstractNumId w:val="8"/>
+    <w:abstractNumId w:val="9"/>
   </w:num>
   <w:num w:numId="25" w16cid:durableId="1690332088">
-    <w:abstractNumId w:val="27"/>
+    <w:abstractNumId w:val="28"/>
   </w:num>
   <w:num w:numId="26" w16cid:durableId="694425795">
-    <w:abstractNumId w:val="5"/>
+    <w:abstractNumId w:val="6"/>
   </w:num>
   <w:num w:numId="27" w16cid:durableId="1298534448">
-    <w:abstractNumId w:val="12"/>
+    <w:abstractNumId w:val="13"/>
   </w:num>
   <w:num w:numId="28" w16cid:durableId="1099109189">
-    <w:abstractNumId w:val="22"/>
+    <w:abstractNumId w:val="23"/>
   </w:num>
   <w:num w:numId="29" w16cid:durableId="2013875221">
-    <w:abstractNumId w:val="15"/>
+    <w:abstractNumId w:val="16"/>
   </w:num>
   <w:num w:numId="30" w16cid:durableId="407659237">
-    <w:abstractNumId w:val="16"/>
+    <w:abstractNumId w:val="17"/>
   </w:num>
   <w:num w:numId="31" w16cid:durableId="1355571654">
-    <w:abstractNumId w:val="20"/>
+    <w:abstractNumId w:val="21"/>
   </w:num>
   <w:num w:numId="32" w16cid:durableId="1055350251">
+    <w:abstractNumId w:val="19"/>
+  </w:num>
+  <w:num w:numId="33" w16cid:durableId="1525678411">
     <w:abstractNumId w:val="18"/>
   </w:num>
-  <w:num w:numId="33" w16cid:durableId="1525678411">
-    <w:abstractNumId w:val="17"/>
+  <w:num w:numId="34" w16cid:durableId="451630993">
+    <w:abstractNumId w:val="5"/>
   </w:num>
 </w:numbering>
 </file>

</xml_diff>